<commit_message>
Update Predicting ATP Tennis match winners.docx
</commit_message>
<xml_diff>
--- a/Predicting ATP Tennis match winners.docx
+++ b/Predicting ATP Tennis match winners.docx
@@ -40,15 +40,7 @@
     </w:p>
     <w:p>
       <w:r>
-        <w:t>This paper develops and evaluates machine learning models to predict ATP tennis match outcomes using only information available prior to each match. The analysis compares a simple ranking-based benchmark with a penalized logistic regression model (LASSO) and a nonlinear gradient boosted tree model (</w:t>
-      </w:r>
-      <w:proofErr w:type="spellStart"/>
-      <w:r>
-        <w:t>XGBoost</w:t>
-      </w:r>
-      <w:proofErr w:type="spellEnd"/>
-      <w:r>
-        <w:t>). The objective is to assess whether more flexible modeling approaches can meaningfully improve prediction beyond rankings alone and to better understand the sources of predictive power in tennis match outcomes.</w:t>
+        <w:t>This paper develops and evaluates machine learning models to predict ATP tennis match outcomes using only information available prior to each match. The analysis compares a simple ranking-based benchmark with a penalized logistic regression model (LASSO) and a nonlinear gradient boosted tree model (XGBoost). The objective is to assess whether more flexible modeling approaches can meaningfully improve prediction beyond rankings alone and to better understand the sources of predictive power in tennis match outcomes.</w:t>
       </w:r>
     </w:p>
     <w:p>
@@ -57,6 +49,26 @@
       </w:r>
     </w:p>
     <w:p>
+      <w:r>
+        <w:t>(T</w:t>
+      </w:r>
+      <w:r>
+        <w:t xml:space="preserve">his may be due to me </w:t>
+      </w:r>
+      <w:r>
+        <w:t>s</w:t>
+      </w:r>
+      <w:r>
+        <w:t>electing the model based on AUC and not purely accuracy</w:t>
+      </w:r>
+      <w:r>
+        <w:t>. Models where tuned on multiple metrics yet I selected based on AUC.</w:t>
+      </w:r>
+      <w:r>
+        <w:t>)</w:t>
+      </w:r>
+    </w:p>
+    <w:p>
       <w:pPr>
         <w:pStyle w:val="Heading1"/>
       </w:pPr>
@@ -65,6 +77,631 @@
       </w:r>
     </w:p>
     <w:p>
+      <w:r>
+        <w:t>The final modeling dataset was built by combining multiple sources:</w:t>
+      </w:r>
+    </w:p>
+    <w:p>
+      <w:pPr>
+        <w:rPr>
+          <w:b/>
+          <w:bCs/>
+        </w:rPr>
+      </w:pPr>
+      <w:r>
+        <w:rPr>
+          <w:b/>
+          <w:bCs/>
+        </w:rPr>
+        <w:t>1. ATP Match Data</w:t>
+      </w:r>
+    </w:p>
+    <w:p>
+      <w:r>
+        <w:lastRenderedPageBreak/>
+        <w:t>Historical ATP tour-level match data from Jeff Sackmann’s publicly available tennis datasets. These files include:</w:t>
+      </w:r>
+    </w:p>
+    <w:p>
+      <w:pPr>
+        <w:numPr>
+          <w:ilvl w:val="0"/>
+          <w:numId w:val="10"/>
+        </w:numPr>
+      </w:pPr>
+      <w:r>
+        <w:t>Match winners and losers</w:t>
+      </w:r>
+    </w:p>
+    <w:p>
+      <w:pPr>
+        <w:numPr>
+          <w:ilvl w:val="0"/>
+          <w:numId w:val="10"/>
+        </w:numPr>
+      </w:pPr>
+      <w:r>
+        <w:t>Tournament name, level, surface, round, and date</w:t>
+      </w:r>
+    </w:p>
+    <w:p>
+      <w:pPr>
+        <w:numPr>
+          <w:ilvl w:val="0"/>
+          <w:numId w:val="10"/>
+        </w:numPr>
+      </w:pPr>
+      <w:r>
+        <w:t>Match statistics (aces, serve percentages, etc.)</w:t>
+      </w:r>
+    </w:p>
+    <w:p>
+      <w:pPr>
+        <w:numPr>
+          <w:ilvl w:val="0"/>
+          <w:numId w:val="10"/>
+        </w:numPr>
+      </w:pPr>
+      <w:r>
+        <w:t>Rankings and ranking points</w:t>
+      </w:r>
+    </w:p>
+    <w:p>
+      <w:pPr>
+        <w:rPr>
+          <w:b/>
+          <w:bCs/>
+        </w:rPr>
+      </w:pPr>
+      <w:r>
+        <w:rPr>
+          <w:b/>
+          <w:bCs/>
+        </w:rPr>
+        <w:t>2. Tournament Location Data</w:t>
+      </w:r>
+    </w:p>
+    <w:p>
+      <w:r>
+        <w:t>Tournament locations were manually standardized and geocoded in order to merge geographic and weather information.</w:t>
+      </w:r>
+    </w:p>
+    <w:p>
+      <w:pPr>
+        <w:rPr>
+          <w:b/>
+          <w:bCs/>
+        </w:rPr>
+      </w:pPr>
+      <w:r>
+        <w:rPr>
+          <w:b/>
+          <w:bCs/>
+        </w:rPr>
+        <w:t>3. NASA POWER Weather Data</w:t>
+      </w:r>
+    </w:p>
+    <w:p>
+      <w:r>
+        <w:t>Daily historical weather observations were collected using tournament coordinates and match dates, including:</w:t>
+      </w:r>
+    </w:p>
+    <w:p>
+      <w:pPr>
+        <w:numPr>
+          <w:ilvl w:val="0"/>
+          <w:numId w:val="11"/>
+        </w:numPr>
+      </w:pPr>
+      <w:r>
+        <w:t>Temperature</w:t>
+      </w:r>
+    </w:p>
+    <w:p>
+      <w:pPr>
+        <w:numPr>
+          <w:ilvl w:val="0"/>
+          <w:numId w:val="11"/>
+        </w:numPr>
+      </w:pPr>
+      <w:r>
+        <w:t>Humidity</w:t>
+      </w:r>
+    </w:p>
+    <w:p>
+      <w:pPr>
+        <w:numPr>
+          <w:ilvl w:val="0"/>
+          <w:numId w:val="11"/>
+        </w:numPr>
+      </w:pPr>
+      <w:r>
+        <w:t>Wind speed</w:t>
+      </w:r>
+    </w:p>
+    <w:p>
+      <w:pPr>
+        <w:numPr>
+          <w:ilvl w:val="0"/>
+          <w:numId w:val="11"/>
+        </w:numPr>
+      </w:pPr>
+      <w:r>
+        <w:t>Precipitation</w:t>
+      </w:r>
+    </w:p>
+    <w:p>
+      <w:pPr>
+        <w:rPr>
+          <w:b/>
+          <w:bCs/>
+        </w:rPr>
+      </w:pPr>
+      <w:r>
+        <w:rPr>
+          <w:b/>
+          <w:bCs/>
+        </w:rPr>
+        <w:t>4. Player Ranking Histories</w:t>
+      </w:r>
+    </w:p>
+    <w:p>
+      <w:r>
+        <w:t>Weekly ATP rankings and points were processed to create lagged ranking features available before each match.</w:t>
+      </w:r>
+    </w:p>
+    <w:p>
+      <w:pPr>
+        <w:rPr>
+          <w:b/>
+          <w:bCs/>
+        </w:rPr>
+      </w:pPr>
+      <w:r>
+        <w:rPr>
+          <w:b/>
+          <w:bCs/>
+        </w:rPr>
+        <w:t>The final data set was cleaned and constructed as follows:</w:t>
+      </w:r>
+    </w:p>
+    <w:p>
+      <w:r>
+        <w:t>The project required extensive data preparation:</w:t>
+      </w:r>
+    </w:p>
+    <w:p>
+      <w:pPr>
+        <w:numPr>
+          <w:ilvl w:val="0"/>
+          <w:numId w:val="12"/>
+        </w:numPr>
+      </w:pPr>
+      <w:r>
+        <w:t>Combined yearly ATP match files into a one dataset</w:t>
+      </w:r>
+    </w:p>
+    <w:p>
+      <w:pPr>
+        <w:numPr>
+          <w:ilvl w:val="0"/>
+          <w:numId w:val="12"/>
+        </w:numPr>
+      </w:pPr>
+      <w:r>
+        <w:t>Restricted analysis to the modern tennis era</w:t>
+      </w:r>
+    </w:p>
+    <w:p>
+      <w:pPr>
+        <w:numPr>
+          <w:ilvl w:val="0"/>
+          <w:numId w:val="12"/>
+        </w:numPr>
+      </w:pPr>
+      <w:r>
+        <w:t>Standardized tournament names and locations</w:t>
+      </w:r>
+    </w:p>
+    <w:p>
+      <w:pPr>
+        <w:numPr>
+          <w:ilvl w:val="0"/>
+          <w:numId w:val="12"/>
+        </w:numPr>
+      </w:pPr>
+      <w:r>
+        <w:t>Geocoded tournament cities and countries</w:t>
+      </w:r>
+    </w:p>
+    <w:p>
+      <w:pPr>
+        <w:numPr>
+          <w:ilvl w:val="0"/>
+          <w:numId w:val="12"/>
+        </w:numPr>
+      </w:pPr>
+      <w:r>
+        <w:t>Merged weather data by location and date</w:t>
+      </w:r>
+    </w:p>
+    <w:p>
+      <w:pPr>
+        <w:numPr>
+          <w:ilvl w:val="0"/>
+          <w:numId w:val="12"/>
+        </w:numPr>
+      </w:pPr>
+      <w:r>
+        <w:t>Constructed lagged ranking and points variables</w:t>
+      </w:r>
+    </w:p>
+    <w:p>
+      <w:pPr>
+        <w:numPr>
+          <w:ilvl w:val="0"/>
+          <w:numId w:val="12"/>
+        </w:numPr>
+      </w:pPr>
+      <w:r>
+        <w:lastRenderedPageBreak/>
+        <w:t>Removed post-match information to prevent data leakage</w:t>
+      </w:r>
+    </w:p>
+    <w:p>
+      <w:pPr>
+        <w:numPr>
+          <w:ilvl w:val="0"/>
+          <w:numId w:val="12"/>
+        </w:numPr>
+      </w:pPr>
+      <w:r>
+        <w:t>Created a final modeling dataset using only pre-match predictors</w:t>
+      </w:r>
+    </w:p>
+    <w:p>
+      <w:pPr>
+        <w:rPr>
+          <w:b/>
+          <w:bCs/>
+        </w:rPr>
+      </w:pPr>
+      <w:r>
+        <w:rPr>
+          <w:b/>
+          <w:bCs/>
+        </w:rPr>
+        <w:t>Feature Engineering</w:t>
+      </w:r>
+    </w:p>
+    <w:p>
+      <w:r>
+        <w:t>A large set of pre-match predictors was engineered, including:</w:t>
+      </w:r>
+    </w:p>
+    <w:p>
+      <w:pPr>
+        <w:rPr>
+          <w:b/>
+          <w:bCs/>
+        </w:rPr>
+      </w:pPr>
+      <w:r>
+        <w:rPr>
+          <w:b/>
+          <w:bCs/>
+        </w:rPr>
+        <w:t>Player Quality Measures</w:t>
+      </w:r>
+    </w:p>
+    <w:p>
+      <w:pPr>
+        <w:numPr>
+          <w:ilvl w:val="0"/>
+          <w:numId w:val="13"/>
+        </w:numPr>
+      </w:pPr>
+      <w:r>
+        <w:t>ATP ranking difference</w:t>
+      </w:r>
+    </w:p>
+    <w:p>
+      <w:pPr>
+        <w:numPr>
+          <w:ilvl w:val="0"/>
+          <w:numId w:val="13"/>
+        </w:numPr>
+      </w:pPr>
+      <w:r>
+        <w:t>Ranking points difference</w:t>
+      </w:r>
+    </w:p>
+    <w:p>
+      <w:pPr>
+        <w:numPr>
+          <w:ilvl w:val="0"/>
+          <w:numId w:val="13"/>
+        </w:numPr>
+      </w:pPr>
+      <w:r>
+        <w:t>Elo rating difference</w:t>
+      </w:r>
+    </w:p>
+    <w:p>
+      <w:pPr>
+        <w:numPr>
+          <w:ilvl w:val="0"/>
+          <w:numId w:val="13"/>
+        </w:numPr>
+      </w:pPr>
+      <w:r>
+        <w:t>Surface-specific Elo difference</w:t>
+      </w:r>
+    </w:p>
+    <w:p>
+      <w:pPr>
+        <w:rPr>
+          <w:b/>
+          <w:bCs/>
+        </w:rPr>
+      </w:pPr>
+      <w:r>
+        <w:rPr>
+          <w:b/>
+          <w:bCs/>
+        </w:rPr>
+        <w:t>Recent performance Measures</w:t>
+      </w:r>
+    </w:p>
+    <w:p>
+      <w:pPr>
+        <w:numPr>
+          <w:ilvl w:val="0"/>
+          <w:numId w:val="14"/>
+        </w:numPr>
+      </w:pPr>
+      <w:r>
+        <w:t>Wins in recent matches</w:t>
+      </w:r>
+    </w:p>
+    <w:p>
+      <w:pPr>
+        <w:numPr>
+          <w:ilvl w:val="0"/>
+          <w:numId w:val="14"/>
+        </w:numPr>
+      </w:pPr>
+      <w:r>
+        <w:t>Rolling win percentages</w:t>
+      </w:r>
+    </w:p>
+    <w:p>
+      <w:pPr>
+        <w:numPr>
+          <w:ilvl w:val="0"/>
+          <w:numId w:val="14"/>
+        </w:numPr>
+      </w:pPr>
+      <w:r>
+        <w:t>Ranking momentum and recent changes</w:t>
+      </w:r>
+    </w:p>
+    <w:p>
+      <w:pPr>
+        <w:rPr>
+          <w:b/>
+          <w:bCs/>
+        </w:rPr>
+      </w:pPr>
+      <w:r>
+        <w:rPr>
+          <w:b/>
+          <w:bCs/>
+        </w:rPr>
+        <w:t>Matchup Measures</w:t>
+      </w:r>
+    </w:p>
+    <w:p>
+      <w:pPr>
+        <w:numPr>
+          <w:ilvl w:val="0"/>
+          <w:numId w:val="15"/>
+        </w:numPr>
+      </w:pPr>
+      <w:r>
+        <w:t>Head-to-head record</w:t>
+      </w:r>
+    </w:p>
+    <w:p>
+      <w:pPr>
+        <w:numPr>
+          <w:ilvl w:val="0"/>
+          <w:numId w:val="15"/>
+        </w:numPr>
+      </w:pPr>
+      <w:r>
+        <w:t>Prior meetings count</w:t>
+      </w:r>
+    </w:p>
+    <w:p>
+      <w:pPr>
+        <w:numPr>
+          <w:ilvl w:val="0"/>
+          <w:numId w:val="15"/>
+        </w:numPr>
+      </w:pPr>
+      <w:r>
+        <w:t>Serve versus return matchup variables</w:t>
+      </w:r>
+    </w:p>
+    <w:p>
+      <w:pPr>
+        <w:rPr>
+          <w:b/>
+          <w:bCs/>
+        </w:rPr>
+      </w:pPr>
+      <w:r>
+        <w:rPr>
+          <w:b/>
+          <w:bCs/>
+        </w:rPr>
+        <w:t>Workload / Fatigue Measures</w:t>
+      </w:r>
+    </w:p>
+    <w:p>
+      <w:pPr>
+        <w:numPr>
+          <w:ilvl w:val="0"/>
+          <w:numId w:val="16"/>
+        </w:numPr>
+      </w:pPr>
+      <w:r>
+        <w:t>Matches played recently</w:t>
+      </w:r>
+    </w:p>
+    <w:p>
+      <w:pPr>
+        <w:numPr>
+          <w:ilvl w:val="0"/>
+          <w:numId w:val="16"/>
+        </w:numPr>
+      </w:pPr>
+      <w:r>
+        <w:t>Surface experience</w:t>
+      </w:r>
+    </w:p>
+    <w:p>
+      <w:pPr>
+        <w:numPr>
+          <w:ilvl w:val="0"/>
+          <w:numId w:val="16"/>
+        </w:numPr>
+      </w:pPr>
+      <w:r>
+        <w:t>Recent activity volume</w:t>
+      </w:r>
+    </w:p>
+    <w:p>
+      <w:pPr>
+        <w:rPr>
+          <w:b/>
+          <w:bCs/>
+        </w:rPr>
+      </w:pPr>
+      <w:r>
+        <w:rPr>
+          <w:b/>
+          <w:bCs/>
+        </w:rPr>
+        <w:t>Tournament and Context Variables</w:t>
+      </w:r>
+    </w:p>
+    <w:p>
+      <w:pPr>
+        <w:numPr>
+          <w:ilvl w:val="0"/>
+          <w:numId w:val="17"/>
+        </w:numPr>
+      </w:pPr>
+      <w:r>
+        <w:t>Surface (hard, clay, grass)</w:t>
+      </w:r>
+    </w:p>
+    <w:p>
+      <w:pPr>
+        <w:numPr>
+          <w:ilvl w:val="0"/>
+          <w:numId w:val="17"/>
+        </w:numPr>
+      </w:pPr>
+      <w:r>
+        <w:t>Tournament level</w:t>
+      </w:r>
+    </w:p>
+    <w:p>
+      <w:pPr>
+        <w:numPr>
+          <w:ilvl w:val="0"/>
+          <w:numId w:val="17"/>
+        </w:numPr>
+      </w:pPr>
+      <w:r>
+        <w:t>Round</w:t>
+      </w:r>
+    </w:p>
+    <w:p>
+      <w:pPr>
+        <w:numPr>
+          <w:ilvl w:val="0"/>
+          <w:numId w:val="17"/>
+        </w:numPr>
+      </w:pPr>
+      <w:r>
+        <w:t>Best-of format</w:t>
+      </w:r>
+    </w:p>
+    <w:p>
+      <w:pPr>
+        <w:rPr>
+          <w:b/>
+          <w:bCs/>
+        </w:rPr>
+      </w:pPr>
+      <w:r>
+        <w:rPr>
+          <w:b/>
+          <w:bCs/>
+        </w:rPr>
+        <w:lastRenderedPageBreak/>
+        <w:t>Weather Variables</w:t>
+      </w:r>
+    </w:p>
+    <w:p>
+      <w:pPr>
+        <w:numPr>
+          <w:ilvl w:val="0"/>
+          <w:numId w:val="18"/>
+        </w:numPr>
+      </w:pPr>
+      <w:r>
+        <w:t>Temperature</w:t>
+      </w:r>
+    </w:p>
+    <w:p>
+      <w:pPr>
+        <w:numPr>
+          <w:ilvl w:val="0"/>
+          <w:numId w:val="18"/>
+        </w:numPr>
+      </w:pPr>
+      <w:r>
+        <w:t>Humidity</w:t>
+      </w:r>
+    </w:p>
+    <w:p>
+      <w:pPr>
+        <w:numPr>
+          <w:ilvl w:val="0"/>
+          <w:numId w:val="18"/>
+        </w:numPr>
+      </w:pPr>
+      <w:r>
+        <w:t>Wind speed</w:t>
+      </w:r>
+    </w:p>
+    <w:p>
+      <w:pPr>
+        <w:numPr>
+          <w:ilvl w:val="0"/>
+          <w:numId w:val="18"/>
+        </w:numPr>
+      </w:pPr>
+      <w:r>
+        <w:t>Precipitation</w:t>
+      </w:r>
+    </w:p>
+    <w:p>
       <w:pPr>
         <w:pStyle w:val="Heading1"/>
       </w:pPr>
@@ -74,6 +711,283 @@
     </w:p>
     <w:p>
       <w:pPr>
+        <w:rPr>
+          <w:b/>
+          <w:bCs/>
+        </w:rPr>
+      </w:pPr>
+      <w:r>
+        <w:rPr>
+          <w:b/>
+          <w:bCs/>
+        </w:rPr>
+        <w:t>Prediction Setup</w:t>
+      </w:r>
+    </w:p>
+    <w:p>
+      <w:r>
+        <w:t>To create a consistent binary classification problem:</w:t>
+      </w:r>
+    </w:p>
+    <w:p>
+      <w:pPr>
+        <w:numPr>
+          <w:ilvl w:val="0"/>
+          <w:numId w:val="19"/>
+        </w:numPr>
+      </w:pPr>
+      <w:r>
+        <w:rPr>
+          <w:b/>
+          <w:bCs/>
+        </w:rPr>
+        <w:t>Player A</w:t>
+      </w:r>
+      <w:r>
+        <w:t> was defined as the </w:t>
+      </w:r>
+      <w:r>
+        <w:rPr>
+          <w:b/>
+          <w:bCs/>
+        </w:rPr>
+        <w:t>higher-ranked player entering the match</w:t>
+      </w:r>
+    </w:p>
+    <w:p>
+      <w:pPr>
+        <w:numPr>
+          <w:ilvl w:val="0"/>
+          <w:numId w:val="19"/>
+        </w:numPr>
+      </w:pPr>
+      <w:r>
+        <w:rPr>
+          <w:b/>
+          <w:bCs/>
+        </w:rPr>
+        <w:t>Player B</w:t>
+      </w:r>
+      <w:r>
+        <w:t> was the lower-ranked player</w:t>
+      </w:r>
+    </w:p>
+    <w:p>
+      <w:r>
+        <w:t>Target variable:</w:t>
+      </w:r>
+    </w:p>
+    <w:p>
+      <w:pPr>
+        <w:numPr>
+          <w:ilvl w:val="0"/>
+          <w:numId w:val="20"/>
+        </w:numPr>
+      </w:pPr>
+      <w:r>
+        <w:t>1 = Player A wins</w:t>
+      </w:r>
+    </w:p>
+    <w:p>
+      <w:pPr>
+        <w:numPr>
+          <w:ilvl w:val="0"/>
+          <w:numId w:val="20"/>
+        </w:numPr>
+      </w:pPr>
+      <w:r>
+        <w:t>0 = Player A loses</w:t>
+      </w:r>
+    </w:p>
+    <w:p>
+      <w:pPr>
+        <w:rPr>
+          <w:b/>
+          <w:bCs/>
+        </w:rPr>
+      </w:pPr>
+      <w:r>
+        <w:rPr>
+          <w:b/>
+          <w:bCs/>
+        </w:rPr>
+        <w:t>Training and Testing Design</w:t>
+      </w:r>
+    </w:p>
+    <w:p>
+      <w:r>
+        <w:t>The dataset was randomly divided into:</w:t>
+      </w:r>
+    </w:p>
+    <w:p>
+      <w:pPr>
+        <w:numPr>
+          <w:ilvl w:val="0"/>
+          <w:numId w:val="21"/>
+        </w:numPr>
+      </w:pPr>
+      <w:r>
+        <w:rPr>
+          <w:b/>
+          <w:bCs/>
+        </w:rPr>
+        <w:t>80% Training Data</w:t>
+      </w:r>
+    </w:p>
+    <w:p>
+      <w:pPr>
+        <w:numPr>
+          <w:ilvl w:val="0"/>
+          <w:numId w:val="21"/>
+        </w:numPr>
+      </w:pPr>
+      <w:r>
+        <w:rPr>
+          <w:b/>
+          <w:bCs/>
+        </w:rPr>
+        <w:t>20% Testing Data</w:t>
+      </w:r>
+    </w:p>
+    <w:p>
+      <w:r>
+        <w:t>The split used stratification on the outcome variable, preserving the proportion of Player A wins and losses in both samples.</w:t>
+      </w:r>
+      <w:r>
+        <w:t xml:space="preserve"> </w:t>
+      </w:r>
+      <w:r>
+        <w:t>This ensured that the training and testing sets had similar class balance and allowed fair model evaluation.</w:t>
+      </w:r>
+      <w:r>
+        <w:t xml:space="preserve"> </w:t>
+      </w:r>
+      <w:r>
+        <w:t>All model tuning was performed using </w:t>
+      </w:r>
+      <w:r>
+        <w:t>cross-validation on the training data only.</w:t>
+      </w:r>
+      <w:r>
+        <w:t xml:space="preserve"> The test set was reserved for final out-of-sample evaluation.</w:t>
+      </w:r>
+    </w:p>
+    <w:p>
+      <w:pPr>
+        <w:rPr>
+          <w:b/>
+          <w:bCs/>
+        </w:rPr>
+      </w:pPr>
+      <w:r>
+        <w:rPr>
+          <w:b/>
+          <w:bCs/>
+        </w:rPr>
+        <w:t>Models Estimated</w:t>
+      </w:r>
+    </w:p>
+    <w:p>
+      <w:pPr>
+        <w:rPr>
+          <w:b/>
+          <w:bCs/>
+        </w:rPr>
+      </w:pPr>
+      <w:r>
+        <w:rPr>
+          <w:b/>
+          <w:bCs/>
+        </w:rPr>
+        <w:t>1. Naive Benchmark</w:t>
+      </w:r>
+    </w:p>
+    <w:p>
+      <w:r>
+        <w:t>Always predict that Player A (the higher-ranked player) wins.</w:t>
+      </w:r>
+    </w:p>
+    <w:p>
+      <w:r>
+        <w:t>This provides a simple baseline showing how predictive rankings already are.</w:t>
+      </w:r>
+    </w:p>
+    <w:p>
+      <w:pPr>
+        <w:rPr>
+          <w:b/>
+          <w:bCs/>
+        </w:rPr>
+      </w:pPr>
+      <w:r>
+        <w:rPr>
+          <w:b/>
+          <w:bCs/>
+        </w:rPr>
+        <w:lastRenderedPageBreak/>
+        <w:t>2. LASSO Logistic Regression</w:t>
+      </w:r>
+    </w:p>
+    <w:p>
+      <w:r>
+        <w:t>A penalized logistic regression model was estimated using LASSO regularization.</w:t>
+      </w:r>
+    </w:p>
+    <w:p>
+      <w:pPr>
+        <w:rPr>
+          <w:b/>
+          <w:bCs/>
+        </w:rPr>
+      </w:pPr>
+      <w:r>
+        <w:rPr>
+          <w:b/>
+          <w:bCs/>
+        </w:rPr>
+        <w:t>3. Gradient Boosted Trees (XGBoost)</w:t>
+      </w:r>
+    </w:p>
+    <w:p>
+      <w:r>
+        <w:t>A nonlinear model was estimated using gradient boosted decision trees.</w:t>
+      </w:r>
+      <w:r>
+        <w:t xml:space="preserve"> This model has the following advantabges</w:t>
+      </w:r>
+    </w:p>
+    <w:p>
+      <w:pPr>
+        <w:numPr>
+          <w:ilvl w:val="0"/>
+          <w:numId w:val="22"/>
+        </w:numPr>
+      </w:pPr>
+      <w:r>
+        <w:t>Captures nonlinear relationships</w:t>
+      </w:r>
+    </w:p>
+    <w:p>
+      <w:pPr>
+        <w:numPr>
+          <w:ilvl w:val="0"/>
+          <w:numId w:val="22"/>
+        </w:numPr>
+      </w:pPr>
+      <w:r>
+        <w:t>Learns interactions automatically</w:t>
+      </w:r>
+    </w:p>
+    <w:p>
+      <w:r>
+        <w:t xml:space="preserve">Models were tuned around Accuracy, </w:t>
+      </w:r>
+      <w:r>
+        <w:t xml:space="preserve">AUC, and mean log loss. The best model was selected by the model with the highest AUC. </w:t>
+      </w:r>
+    </w:p>
+    <w:p>
+      <w:pPr>
         <w:pStyle w:val="Heading1"/>
       </w:pPr>
       <w:r>
@@ -82,15 +996,7 @@
     </w:p>
     <w:p>
       <w:r>
-        <w:t>Table 1 presents the out-of-sample performance of the naive benchmark, LASSO logistic regression, and gradient boosted tree (</w:t>
-      </w:r>
-      <w:proofErr w:type="spellStart"/>
-      <w:r>
-        <w:t>XGBoost</w:t>
-      </w:r>
-      <w:proofErr w:type="spellEnd"/>
-      <w:r>
-        <w:t>) models.</w:t>
+        <w:t>Table 1 presents the out-of-sample performance of the naive benchmark, LASSO logistic regression, and gradient boosted tree (XGBoost) models.</w:t>
       </w:r>
     </w:p>
     <w:p>
@@ -238,7 +1144,6 @@
               </w:rPr>
               <w:t xml:space="preserve"> </w:t>
             </w:r>
-            <w:proofErr w:type="spellStart"/>
             <w:r>
               <w:rPr>
                 <w:b/>
@@ -246,7 +1151,6 @@
               </w:rPr>
               <w:t>auc</w:t>
             </w:r>
-            <w:proofErr w:type="spellEnd"/>
           </w:p>
         </w:tc>
         <w:tc>
@@ -491,11 +1395,9 @@
             <w:hideMark/>
           </w:tcPr>
           <w:p>
-            <w:proofErr w:type="spellStart"/>
             <w:r>
               <w:t>XGBoost</w:t>
             </w:r>
-            <w:proofErr w:type="spellEnd"/>
           </w:p>
         </w:tc>
         <w:tc>
@@ -580,27 +1482,12 @@
         <w:t>T</w:t>
       </w:r>
       <w:r>
-        <w:t xml:space="preserve">he gradient boosted tree model delivers the strongest overall predictive performance. </w:t>
-      </w:r>
-      <w:proofErr w:type="spellStart"/>
-      <w:r>
-        <w:t>XGBoost</w:t>
-      </w:r>
-      <w:proofErr w:type="spellEnd"/>
-      <w:r>
-        <w:t xml:space="preserve"> increases accuracy to 67.0%, representing a modest improvement over both the naive benchmark and the LASSO model. This improvement is more pronounced in the ROC AUC metric, where </w:t>
-      </w:r>
-      <w:proofErr w:type="spellStart"/>
-      <w:r>
-        <w:t>XGBoost</w:t>
-      </w:r>
-      <w:proofErr w:type="spellEnd"/>
-      <w:r>
-        <w:t xml:space="preserve"> achieves a value of 0.679 compared to 0.612 for LASSO and 0.500 for the naive benchmark. This suggests that the boosted tree model more effectively ranks match outcomes by probability.</w:t>
-      </w:r>
-    </w:p>
-    <w:p>
-      <w:r>
+        <w:t>he gradient boosted tree model delivers the strongest overall predictive performance. XGBoost increases accuracy to 67.0%, representing a modest improvement over both the naive benchmark and the LASSO model. This improvement is more pronounced in the ROC AUC metric, where XGBoost achieves a value of 0.679 compared to 0.612 for LASSO and 0.500 for the naive benchmark. This suggests that the boosted tree model more effectively ranks match outcomes by probability.</w:t>
+      </w:r>
+    </w:p>
+    <w:p>
+      <w:r>
+        <w:lastRenderedPageBreak/>
         <w:t>Figure 1.</w:t>
       </w:r>
     </w:p>
@@ -627,23 +1514,15 @@
             <o:lock v:ext="edit" aspectratio="t"/>
           </v:shapetype>
           <v:shape id="_x0000_i1025" type="#_x0000_t75" style="width:513.4pt;height:308.65pt" o:ole="">
-            <v:imagedata r:id="rId6" o:title=""/>
+            <v:imagedata r:id="rId7" o:title=""/>
           </v:shape>
-          <o:OLEObject Type="Embed" ProgID="Acrobat.Document.DC" ShapeID="_x0000_i1025" DrawAspect="Content" ObjectID="_1838978186" r:id="rId7"/>
+          <o:OLEObject Type="Embed" ProgID="Acrobat.Document.DC" ShapeID="_x0000_i1025" DrawAspect="Content" ObjectID="_1839065393" r:id="rId8"/>
         </w:object>
       </w:r>
     </w:p>
     <w:p>
       <w:r>
-        <w:t xml:space="preserve">The models also exhibit clear differences in their prediction behavior. </w:t>
-      </w:r>
-      <w:proofErr w:type="spellStart"/>
-      <w:r>
-        <w:t>XGBoost</w:t>
-      </w:r>
-      <w:proofErr w:type="spellEnd"/>
-      <w:r>
-        <w:t xml:space="preserve"> achieves a high sensitivity of 0.892, indicating strong performance in correctly predicting matches where the higher-ranked player wi</w:t>
+        <w:t>The models also exhibit clear differences in their prediction behavior. XGBoost achieves a high sensitivity of 0.892, indicating strong performance in correctly predicting matches where the higher-ranked player wi</w:t>
       </w:r>
       <w:r>
         <w:t>ns</w:t>
@@ -659,15 +1538,7 @@
     </w:p>
     <w:p>
       <w:r>
-        <w:t xml:space="preserve">Finally, mean log loss highlights substantial differences. The </w:t>
-      </w:r>
-      <w:proofErr w:type="spellStart"/>
-      <w:r>
-        <w:t>XGBoost</w:t>
-      </w:r>
-      <w:proofErr w:type="spellEnd"/>
-      <w:r>
-        <w:t xml:space="preserve"> model achieves a dramatically lower log loss (0.598) compared to LASSO (10.639) and the naive benchmark (12.556). This indicates that the boosted tree model produces more accurate and well-calibrated predicted probabilities, while LASSO tends to generate overly extreme and poorly calibrated predictions.</w:t>
+        <w:t>Finally, mean log loss highlights substantial differences. The XGBoost model achieves a dramatically lower log loss (0.598) compared to LASSO (10.639) and the naive benchmark (12.556). This indicates that the boosted tree model produces more accurate and well-calibrated predicted probabilities, while LASSO tends to generate overly extreme and poorly calibrated predictions.</w:t>
       </w:r>
       <w:r>
         <w:t xml:space="preserve"> </w:t>
@@ -691,15 +1562,21 @@
       <w:r>
         <w:object w:dxaOrig="10801" w:dyaOrig="6481" w14:anchorId="48EED72E">
           <v:shape id="_x0000_i1026" type="#_x0000_t75" style="width:487.1pt;height:292.4pt" o:ole="">
-            <v:imagedata r:id="rId8" o:title=""/>
+            <v:imagedata r:id="rId9" o:title=""/>
           </v:shape>
-          <o:OLEObject Type="Embed" ProgID="Acrobat.Document.DC" ShapeID="_x0000_i1026" DrawAspect="Content" ObjectID="_1838978187" r:id="rId9"/>
+          <o:OLEObject Type="Embed" ProgID="Acrobat.Document.DC" ShapeID="_x0000_i1026" DrawAspect="Content" ObjectID="_1839065394" r:id="rId10"/>
         </w:object>
       </w:r>
     </w:p>
     <w:p>
       <w:r>
-        <w:t>Figure 1 evaluates the calibration of predicted win probabilities for the LASSO and gradient boosted tree models. A perfectly calibrated model would produce predictions that lie along the 45-degree line, where predicted probabilities match observed win frequencies.</w:t>
+        <w:t xml:space="preserve">Figure </w:t>
+      </w:r>
+      <w:r>
+        <w:t>2</w:t>
+      </w:r>
+      <w:r>
+        <w:t xml:space="preserve"> evaluates the calibration of predicted win probabilities for the LASSO and gradient boosted tree models. A perfectly calibrated model would produce predictions that lie along the 45-degree line, where predicted probabilities match observed win frequencies.</w:t>
       </w:r>
     </w:p>
     <w:p>
@@ -709,15 +1586,7 @@
     </w:p>
     <w:p>
       <w:r>
-        <w:t xml:space="preserve">In contrast, the gradient boosted tree model closely follows the 45-degree line across the range of predicted probabilities, indicating strong calibration. Predicted probabilities from the </w:t>
-      </w:r>
-      <w:proofErr w:type="spellStart"/>
-      <w:r>
-        <w:t>XGBoost</w:t>
-      </w:r>
-      <w:proofErr w:type="spellEnd"/>
-      <w:r>
-        <w:t xml:space="preserve"> model closely correspond to realized outcomes, suggesting that the model effectively captures uncertainty in match results. Notably, the model avoids assigning extreme probabilities near 0% or 100%, reflecting a more realistic assessment of outcome uncertainty.</w:t>
+        <w:t>In contrast, the gradient boosted tree model closely follows the 45-degree line across the range of predicted probabilities, indicating strong calibration. Predicted probabilities from the XGBoost model closely correspond to realized outcomes, suggesting that the model effectively captures uncertainty in match results. Notably, the model avoids assigning extreme probabilities near 0% or 100%, reflecting a more realistic assessment of outcome uncertainty.</w:t>
       </w:r>
     </w:p>
     <w:p>
@@ -734,34 +1603,11 @@
     <w:p/>
     <w:p>
       <w:r>
-        <w:t xml:space="preserve">While the </w:t>
-      </w:r>
-      <w:proofErr w:type="spellStart"/>
-      <w:r>
-        <w:t>xgboosts</w:t>
-      </w:r>
-      <w:proofErr w:type="spellEnd"/>
-      <w:r>
-        <w:t xml:space="preserve"> main  improvement from the naïve baseline model is a improvement in the calibration of predicted </w:t>
-      </w:r>
-      <w:proofErr w:type="spellStart"/>
-      <w:r>
-        <w:t>propabilities</w:t>
-      </w:r>
-      <w:proofErr w:type="spellEnd"/>
-      <w:r>
-        <w:t xml:space="preserve"> it also does improve overall prediction accuracy. Figure 3 provides a visualization of </w:t>
-      </w:r>
-      <w:r>
-        <w:t xml:space="preserve">which matchups the </w:t>
-      </w:r>
-      <w:proofErr w:type="spellStart"/>
-      <w:r>
-        <w:t>xgboost</w:t>
-      </w:r>
-      <w:proofErr w:type="spellEnd"/>
-      <w:r>
-        <w:t xml:space="preserve"> model </w:t>
+        <w:lastRenderedPageBreak/>
+        <w:t xml:space="preserve">While the xgboosts main  improvement from the naïve baseline model is a improvement in the calibration of predicted propabilities it also does improve overall prediction accuracy. Figure 3 provides a visualization of </w:t>
+      </w:r>
+      <w:r>
+        <w:t xml:space="preserve">which matchups the xgboost model </w:t>
       </w:r>
       <w:r>
         <w:t xml:space="preserve">outperforms the lasso and naïve baseline. </w:t>
@@ -779,9 +1625,9 @@
       <w:r>
         <w:object w:dxaOrig="9720" w:dyaOrig="6481" w14:anchorId="38DB0856">
           <v:shape id="_x0000_i1027" type="#_x0000_t75" style="width:486.45pt;height:324.3pt" o:ole="">
-            <v:imagedata r:id="rId10" o:title=""/>
+            <v:imagedata r:id="rId11" o:title=""/>
           </v:shape>
-          <o:OLEObject Type="Embed" ProgID="Acrobat.Document.DC" ShapeID="_x0000_i1027" DrawAspect="Content" ObjectID="_1838978188" r:id="rId11"/>
+          <o:OLEObject Type="Embed" ProgID="Acrobat.Document.DC" ShapeID="_x0000_i1027" DrawAspect="Content" ObjectID="_1839065395" r:id="rId12"/>
         </w:object>
       </w:r>
     </w:p>
@@ -810,11 +1656,9 @@
       <w:r>
         <w:t xml:space="preserve">converges with the </w:t>
       </w:r>
-      <w:proofErr w:type="spellStart"/>
       <w:r>
         <w:t>xgboost</w:t>
       </w:r>
-      <w:proofErr w:type="spellEnd"/>
       <w:r>
         <w:t xml:space="preserve"> model in accuracy. It is only when ranking differences are </w:t>
       </w:r>
@@ -822,37 +1666,21 @@
         <w:t>low,</w:t>
       </w:r>
       <w:r>
-        <w:t xml:space="preserve"> specifically between 0-10 that the </w:t>
-      </w:r>
-      <w:proofErr w:type="spellStart"/>
-      <w:r>
-        <w:t>xgboost</w:t>
-      </w:r>
-      <w:proofErr w:type="spellEnd"/>
-      <w:r>
-        <w:t xml:space="preserve"> model captures predictive information beyond ranks.</w:t>
-      </w:r>
-    </w:p>
-    <w:p>
-      <w:r>
-        <w:t xml:space="preserve">To better understand our models figure 4 and 5 plot the most important predictors in both the lasso and </w:t>
-      </w:r>
-      <w:proofErr w:type="spellStart"/>
-      <w:r>
-        <w:t>xgboost</w:t>
-      </w:r>
-      <w:proofErr w:type="spellEnd"/>
-      <w:r>
-        <w:t xml:space="preserve"> models. </w:t>
+        <w:t xml:space="preserve"> specifically between 0-10 that the xgboost model captures predictive information beyond ranks.</w:t>
+      </w:r>
+    </w:p>
+    <w:p>
+      <w:r>
+        <w:t xml:space="preserve">To better understand our models figure 4 and 5 plot the most important predictors in both the lasso and xgboost models. </w:t>
       </w:r>
     </w:p>
     <w:p>
       <w:r>
         <w:object w:dxaOrig="10801" w:dyaOrig="7560" w14:anchorId="015535E1">
           <v:shape id="_x0000_i1028" type="#_x0000_t75" style="width:487.1pt;height:341.2pt" o:ole="">
-            <v:imagedata r:id="rId12" o:title=""/>
+            <v:imagedata r:id="rId13" o:title=""/>
           </v:shape>
-          <o:OLEObject Type="Embed" ProgID="Acrobat.Document.DC" ShapeID="_x0000_i1028" DrawAspect="Content" ObjectID="_1838978189" r:id="rId13"/>
+          <o:OLEObject Type="Embed" ProgID="Acrobat.Document.DC" ShapeID="_x0000_i1028" DrawAspect="Content" ObjectID="_1839065396" r:id="rId14"/>
         </w:object>
       </w:r>
     </w:p>
@@ -861,9 +1689,9 @@
       <w:r>
         <w:object w:dxaOrig="10801" w:dyaOrig="7560" w14:anchorId="2239EF99">
           <v:shape id="_x0000_i1029" type="#_x0000_t75" style="width:451.4pt;height:316.15pt" o:ole="">
-            <v:imagedata r:id="rId14" o:title=""/>
+            <v:imagedata r:id="rId15" o:title=""/>
           </v:shape>
-          <o:OLEObject Type="Embed" ProgID="Acrobat.Document.DC" ShapeID="_x0000_i1029" DrawAspect="Content" ObjectID="_1838978190" r:id="rId15"/>
+          <o:OLEObject Type="Embed" ProgID="Acrobat.Document.DC" ShapeID="_x0000_i1029" DrawAspect="Content" ObjectID="_1839065397" r:id="rId16"/>
         </w:object>
       </w:r>
     </w:p>
@@ -932,6 +1760,3507 @@
     </w:p>
   </w:footnote>
 </w:footnotes>
+</file>
+
+<file path=word/numbering.xml><?xml version="1.0" encoding="utf-8"?>
+<w:numbering xmlns:wpc="http://schemas.microsoft.com/office/word/2010/wordprocessingCanvas" xmlns:cx="http://schemas.microsoft.com/office/drawing/2014/chartex" xmlns:cx1="http://schemas.microsoft.com/office/drawing/2015/9/8/chartex" xmlns:cx2="http://schemas.microsoft.com/office/drawing/2015/10/21/chartex" xmlns:cx3="http://schemas.microsoft.com/office/drawing/2016/5/9/chartex" xmlns:cx4="http://schemas.microsoft.com/office/drawing/2016/5/10/chartex" xmlns:cx5="http://schemas.microsoft.com/office/drawing/2016/5/11/chartex" xmlns:cx6="http://schemas.microsoft.com/office/drawing/2016/5/12/chartex" xmlns:cx7="http://schemas.microsoft.com/office/drawing/2016/5/13/chartex" xmlns:cx8="http://schemas.microsoft.com/office/drawing/2016/5/14/chartex" xmlns:mc="http://schemas.openxmlformats.org/markup-compatibility/2006" xmlns:aink="http://schemas.microsoft.com/office/drawing/2016/ink" xmlns:am3d="http://schemas.microsoft.com/office/drawing/2017/model3d" xmlns:o="urn:schemas-microsoft-com:office:office" xmlns:oel="http://schemas.microsoft.com/office/2019/extlst" xmlns:r="http://schemas.openxmlformats.org/officeDocument/2006/relationships" xmlns:m="http://schemas.openxmlformats.org/officeDocument/2006/math" xmlns:v="urn:schemas-microsoft-com:vml" xmlns:wp14="http://schemas.microsoft.com/office/word/2010/wordprocessingDrawing" xmlns:wp="http://schemas.openxmlformats.org/drawingml/2006/wordprocessingDrawing" xmlns:w10="urn:schemas-microsoft-com:office:word" xmlns:w="http://schemas.openxmlformats.org/wordprocessingml/2006/main" xmlns:w14="http://schemas.microsoft.com/office/word/2010/wordml" xmlns:w15="http://schemas.microsoft.com/office/word/2012/wordml" xmlns:w16cex="http://schemas.microsoft.com/office/word/2018/wordml/cex" xmlns:w16cid="http://schemas.microsoft.com/office/word/2016/wordml/cid" xmlns:w16="http://schemas.microsoft.com/office/word/2018/wordml" xmlns:w16du="http://schemas.microsoft.com/office/word/2023/wordml/word16du" xmlns:w16sdtdh="http://schemas.microsoft.com/office/word/2020/wordml/sdtdatahash" xmlns:w16sdtfl="http://schemas.microsoft.com/office/word/2024/wordml/sdtformatlock" xmlns:w16se="http://schemas.microsoft.com/office/word/2015/wordml/symex" xmlns:wpg="http://schemas.microsoft.com/office/word/2010/wordprocessingGroup" xmlns:wpi="http://schemas.microsoft.com/office/word/2010/wordprocessingInk" xmlns:wne="http://schemas.microsoft.com/office/word/2006/wordml" xmlns:wps="http://schemas.microsoft.com/office/word/2010/wordprocessingShape" mc:Ignorable="w14 w15 w16se w16cid w16 w16cex w16sdtdh w16sdtfl w16du wp14">
+  <w:abstractNum w:abstractNumId="0" w15:restartNumberingAfterBreak="0">
+    <w:nsid w:val="07CE2A75"/>
+    <w:multiLevelType w:val="multilevel"/>
+    <w:tmpl w:val="1FDEFDAA"/>
+    <w:lvl w:ilvl="0">
+      <w:start w:val="1"/>
+      <w:numFmt w:val="bullet"/>
+      <w:lvlText w:val=""/>
+      <w:lvlJc w:val="left"/>
+      <w:pPr>
+        <w:tabs>
+          <w:tab w:val="num" w:pos="720"/>
+        </w:tabs>
+        <w:ind w:left="720" w:hanging="360"/>
+      </w:pPr>
+      <w:rPr>
+        <w:rFonts w:ascii="Symbol" w:hAnsi="Symbol" w:hint="default"/>
+        <w:sz w:val="20"/>
+      </w:rPr>
+    </w:lvl>
+    <w:lvl w:ilvl="1" w:tentative="1">
+      <w:start w:val="1"/>
+      <w:numFmt w:val="bullet"/>
+      <w:lvlText w:val="o"/>
+      <w:lvlJc w:val="left"/>
+      <w:pPr>
+        <w:tabs>
+          <w:tab w:val="num" w:pos="1440"/>
+        </w:tabs>
+        <w:ind w:left="1440" w:hanging="360"/>
+      </w:pPr>
+      <w:rPr>
+        <w:rFonts w:ascii="Courier New" w:hAnsi="Courier New" w:hint="default"/>
+        <w:sz w:val="20"/>
+      </w:rPr>
+    </w:lvl>
+    <w:lvl w:ilvl="2" w:tentative="1">
+      <w:start w:val="1"/>
+      <w:numFmt w:val="bullet"/>
+      <w:lvlText w:val=""/>
+      <w:lvlJc w:val="left"/>
+      <w:pPr>
+        <w:tabs>
+          <w:tab w:val="num" w:pos="2160"/>
+        </w:tabs>
+        <w:ind w:left="2160" w:hanging="360"/>
+      </w:pPr>
+      <w:rPr>
+        <w:rFonts w:ascii="Wingdings" w:hAnsi="Wingdings" w:hint="default"/>
+        <w:sz w:val="20"/>
+      </w:rPr>
+    </w:lvl>
+    <w:lvl w:ilvl="3" w:tentative="1">
+      <w:start w:val="1"/>
+      <w:numFmt w:val="bullet"/>
+      <w:lvlText w:val=""/>
+      <w:lvlJc w:val="left"/>
+      <w:pPr>
+        <w:tabs>
+          <w:tab w:val="num" w:pos="2880"/>
+        </w:tabs>
+        <w:ind w:left="2880" w:hanging="360"/>
+      </w:pPr>
+      <w:rPr>
+        <w:rFonts w:ascii="Wingdings" w:hAnsi="Wingdings" w:hint="default"/>
+        <w:sz w:val="20"/>
+      </w:rPr>
+    </w:lvl>
+    <w:lvl w:ilvl="4" w:tentative="1">
+      <w:start w:val="1"/>
+      <w:numFmt w:val="bullet"/>
+      <w:lvlText w:val=""/>
+      <w:lvlJc w:val="left"/>
+      <w:pPr>
+        <w:tabs>
+          <w:tab w:val="num" w:pos="3600"/>
+        </w:tabs>
+        <w:ind w:left="3600" w:hanging="360"/>
+      </w:pPr>
+      <w:rPr>
+        <w:rFonts w:ascii="Wingdings" w:hAnsi="Wingdings" w:hint="default"/>
+        <w:sz w:val="20"/>
+      </w:rPr>
+    </w:lvl>
+    <w:lvl w:ilvl="5" w:tentative="1">
+      <w:start w:val="1"/>
+      <w:numFmt w:val="bullet"/>
+      <w:lvlText w:val=""/>
+      <w:lvlJc w:val="left"/>
+      <w:pPr>
+        <w:tabs>
+          <w:tab w:val="num" w:pos="4320"/>
+        </w:tabs>
+        <w:ind w:left="4320" w:hanging="360"/>
+      </w:pPr>
+      <w:rPr>
+        <w:rFonts w:ascii="Wingdings" w:hAnsi="Wingdings" w:hint="default"/>
+        <w:sz w:val="20"/>
+      </w:rPr>
+    </w:lvl>
+    <w:lvl w:ilvl="6" w:tentative="1">
+      <w:start w:val="1"/>
+      <w:numFmt w:val="bullet"/>
+      <w:lvlText w:val=""/>
+      <w:lvlJc w:val="left"/>
+      <w:pPr>
+        <w:tabs>
+          <w:tab w:val="num" w:pos="5040"/>
+        </w:tabs>
+        <w:ind w:left="5040" w:hanging="360"/>
+      </w:pPr>
+      <w:rPr>
+        <w:rFonts w:ascii="Wingdings" w:hAnsi="Wingdings" w:hint="default"/>
+        <w:sz w:val="20"/>
+      </w:rPr>
+    </w:lvl>
+    <w:lvl w:ilvl="7" w:tentative="1">
+      <w:start w:val="1"/>
+      <w:numFmt w:val="bullet"/>
+      <w:lvlText w:val=""/>
+      <w:lvlJc w:val="left"/>
+      <w:pPr>
+        <w:tabs>
+          <w:tab w:val="num" w:pos="5760"/>
+        </w:tabs>
+        <w:ind w:left="5760" w:hanging="360"/>
+      </w:pPr>
+      <w:rPr>
+        <w:rFonts w:ascii="Wingdings" w:hAnsi="Wingdings" w:hint="default"/>
+        <w:sz w:val="20"/>
+      </w:rPr>
+    </w:lvl>
+    <w:lvl w:ilvl="8" w:tentative="1">
+      <w:start w:val="1"/>
+      <w:numFmt w:val="bullet"/>
+      <w:lvlText w:val=""/>
+      <w:lvlJc w:val="left"/>
+      <w:pPr>
+        <w:tabs>
+          <w:tab w:val="num" w:pos="6480"/>
+        </w:tabs>
+        <w:ind w:left="6480" w:hanging="360"/>
+      </w:pPr>
+      <w:rPr>
+        <w:rFonts w:ascii="Wingdings" w:hAnsi="Wingdings" w:hint="default"/>
+        <w:sz w:val="20"/>
+      </w:rPr>
+    </w:lvl>
+  </w:abstractNum>
+  <w:abstractNum w:abstractNumId="1" w15:restartNumberingAfterBreak="0">
+    <w:nsid w:val="1221407C"/>
+    <w:multiLevelType w:val="multilevel"/>
+    <w:tmpl w:val="47ACF598"/>
+    <w:lvl w:ilvl="0">
+      <w:start w:val="1"/>
+      <w:numFmt w:val="bullet"/>
+      <w:lvlText w:val=""/>
+      <w:lvlJc w:val="left"/>
+      <w:pPr>
+        <w:tabs>
+          <w:tab w:val="num" w:pos="720"/>
+        </w:tabs>
+        <w:ind w:left="720" w:hanging="360"/>
+      </w:pPr>
+      <w:rPr>
+        <w:rFonts w:ascii="Symbol" w:hAnsi="Symbol" w:hint="default"/>
+        <w:sz w:val="20"/>
+      </w:rPr>
+    </w:lvl>
+    <w:lvl w:ilvl="1" w:tentative="1">
+      <w:start w:val="1"/>
+      <w:numFmt w:val="bullet"/>
+      <w:lvlText w:val="o"/>
+      <w:lvlJc w:val="left"/>
+      <w:pPr>
+        <w:tabs>
+          <w:tab w:val="num" w:pos="1440"/>
+        </w:tabs>
+        <w:ind w:left="1440" w:hanging="360"/>
+      </w:pPr>
+      <w:rPr>
+        <w:rFonts w:ascii="Courier New" w:hAnsi="Courier New" w:hint="default"/>
+        <w:sz w:val="20"/>
+      </w:rPr>
+    </w:lvl>
+    <w:lvl w:ilvl="2" w:tentative="1">
+      <w:start w:val="1"/>
+      <w:numFmt w:val="bullet"/>
+      <w:lvlText w:val=""/>
+      <w:lvlJc w:val="left"/>
+      <w:pPr>
+        <w:tabs>
+          <w:tab w:val="num" w:pos="2160"/>
+        </w:tabs>
+        <w:ind w:left="2160" w:hanging="360"/>
+      </w:pPr>
+      <w:rPr>
+        <w:rFonts w:ascii="Wingdings" w:hAnsi="Wingdings" w:hint="default"/>
+        <w:sz w:val="20"/>
+      </w:rPr>
+    </w:lvl>
+    <w:lvl w:ilvl="3" w:tentative="1">
+      <w:start w:val="1"/>
+      <w:numFmt w:val="bullet"/>
+      <w:lvlText w:val=""/>
+      <w:lvlJc w:val="left"/>
+      <w:pPr>
+        <w:tabs>
+          <w:tab w:val="num" w:pos="2880"/>
+        </w:tabs>
+        <w:ind w:left="2880" w:hanging="360"/>
+      </w:pPr>
+      <w:rPr>
+        <w:rFonts w:ascii="Wingdings" w:hAnsi="Wingdings" w:hint="default"/>
+        <w:sz w:val="20"/>
+      </w:rPr>
+    </w:lvl>
+    <w:lvl w:ilvl="4" w:tentative="1">
+      <w:start w:val="1"/>
+      <w:numFmt w:val="bullet"/>
+      <w:lvlText w:val=""/>
+      <w:lvlJc w:val="left"/>
+      <w:pPr>
+        <w:tabs>
+          <w:tab w:val="num" w:pos="3600"/>
+        </w:tabs>
+        <w:ind w:left="3600" w:hanging="360"/>
+      </w:pPr>
+      <w:rPr>
+        <w:rFonts w:ascii="Wingdings" w:hAnsi="Wingdings" w:hint="default"/>
+        <w:sz w:val="20"/>
+      </w:rPr>
+    </w:lvl>
+    <w:lvl w:ilvl="5" w:tentative="1">
+      <w:start w:val="1"/>
+      <w:numFmt w:val="bullet"/>
+      <w:lvlText w:val=""/>
+      <w:lvlJc w:val="left"/>
+      <w:pPr>
+        <w:tabs>
+          <w:tab w:val="num" w:pos="4320"/>
+        </w:tabs>
+        <w:ind w:left="4320" w:hanging="360"/>
+      </w:pPr>
+      <w:rPr>
+        <w:rFonts w:ascii="Wingdings" w:hAnsi="Wingdings" w:hint="default"/>
+        <w:sz w:val="20"/>
+      </w:rPr>
+    </w:lvl>
+    <w:lvl w:ilvl="6" w:tentative="1">
+      <w:start w:val="1"/>
+      <w:numFmt w:val="bullet"/>
+      <w:lvlText w:val=""/>
+      <w:lvlJc w:val="left"/>
+      <w:pPr>
+        <w:tabs>
+          <w:tab w:val="num" w:pos="5040"/>
+        </w:tabs>
+        <w:ind w:left="5040" w:hanging="360"/>
+      </w:pPr>
+      <w:rPr>
+        <w:rFonts w:ascii="Wingdings" w:hAnsi="Wingdings" w:hint="default"/>
+        <w:sz w:val="20"/>
+      </w:rPr>
+    </w:lvl>
+    <w:lvl w:ilvl="7" w:tentative="1">
+      <w:start w:val="1"/>
+      <w:numFmt w:val="bullet"/>
+      <w:lvlText w:val=""/>
+      <w:lvlJc w:val="left"/>
+      <w:pPr>
+        <w:tabs>
+          <w:tab w:val="num" w:pos="5760"/>
+        </w:tabs>
+        <w:ind w:left="5760" w:hanging="360"/>
+      </w:pPr>
+      <w:rPr>
+        <w:rFonts w:ascii="Wingdings" w:hAnsi="Wingdings" w:hint="default"/>
+        <w:sz w:val="20"/>
+      </w:rPr>
+    </w:lvl>
+    <w:lvl w:ilvl="8" w:tentative="1">
+      <w:start w:val="1"/>
+      <w:numFmt w:val="bullet"/>
+      <w:lvlText w:val=""/>
+      <w:lvlJc w:val="left"/>
+      <w:pPr>
+        <w:tabs>
+          <w:tab w:val="num" w:pos="6480"/>
+        </w:tabs>
+        <w:ind w:left="6480" w:hanging="360"/>
+      </w:pPr>
+      <w:rPr>
+        <w:rFonts w:ascii="Wingdings" w:hAnsi="Wingdings" w:hint="default"/>
+        <w:sz w:val="20"/>
+      </w:rPr>
+    </w:lvl>
+  </w:abstractNum>
+  <w:abstractNum w:abstractNumId="2" w15:restartNumberingAfterBreak="0">
+    <w:nsid w:val="14121D92"/>
+    <w:multiLevelType w:val="multilevel"/>
+    <w:tmpl w:val="472CF810"/>
+    <w:lvl w:ilvl="0">
+      <w:start w:val="1"/>
+      <w:numFmt w:val="bullet"/>
+      <w:lvlText w:val=""/>
+      <w:lvlJc w:val="left"/>
+      <w:pPr>
+        <w:tabs>
+          <w:tab w:val="num" w:pos="720"/>
+        </w:tabs>
+        <w:ind w:left="720" w:hanging="360"/>
+      </w:pPr>
+      <w:rPr>
+        <w:rFonts w:ascii="Symbol" w:hAnsi="Symbol" w:hint="default"/>
+        <w:sz w:val="20"/>
+      </w:rPr>
+    </w:lvl>
+    <w:lvl w:ilvl="1" w:tentative="1">
+      <w:start w:val="1"/>
+      <w:numFmt w:val="bullet"/>
+      <w:lvlText w:val="o"/>
+      <w:lvlJc w:val="left"/>
+      <w:pPr>
+        <w:tabs>
+          <w:tab w:val="num" w:pos="1440"/>
+        </w:tabs>
+        <w:ind w:left="1440" w:hanging="360"/>
+      </w:pPr>
+      <w:rPr>
+        <w:rFonts w:ascii="Courier New" w:hAnsi="Courier New" w:hint="default"/>
+        <w:sz w:val="20"/>
+      </w:rPr>
+    </w:lvl>
+    <w:lvl w:ilvl="2" w:tentative="1">
+      <w:start w:val="1"/>
+      <w:numFmt w:val="bullet"/>
+      <w:lvlText w:val=""/>
+      <w:lvlJc w:val="left"/>
+      <w:pPr>
+        <w:tabs>
+          <w:tab w:val="num" w:pos="2160"/>
+        </w:tabs>
+        <w:ind w:left="2160" w:hanging="360"/>
+      </w:pPr>
+      <w:rPr>
+        <w:rFonts w:ascii="Wingdings" w:hAnsi="Wingdings" w:hint="default"/>
+        <w:sz w:val="20"/>
+      </w:rPr>
+    </w:lvl>
+    <w:lvl w:ilvl="3" w:tentative="1">
+      <w:start w:val="1"/>
+      <w:numFmt w:val="bullet"/>
+      <w:lvlText w:val=""/>
+      <w:lvlJc w:val="left"/>
+      <w:pPr>
+        <w:tabs>
+          <w:tab w:val="num" w:pos="2880"/>
+        </w:tabs>
+        <w:ind w:left="2880" w:hanging="360"/>
+      </w:pPr>
+      <w:rPr>
+        <w:rFonts w:ascii="Wingdings" w:hAnsi="Wingdings" w:hint="default"/>
+        <w:sz w:val="20"/>
+      </w:rPr>
+    </w:lvl>
+    <w:lvl w:ilvl="4" w:tentative="1">
+      <w:start w:val="1"/>
+      <w:numFmt w:val="bullet"/>
+      <w:lvlText w:val=""/>
+      <w:lvlJc w:val="left"/>
+      <w:pPr>
+        <w:tabs>
+          <w:tab w:val="num" w:pos="3600"/>
+        </w:tabs>
+        <w:ind w:left="3600" w:hanging="360"/>
+      </w:pPr>
+      <w:rPr>
+        <w:rFonts w:ascii="Wingdings" w:hAnsi="Wingdings" w:hint="default"/>
+        <w:sz w:val="20"/>
+      </w:rPr>
+    </w:lvl>
+    <w:lvl w:ilvl="5" w:tentative="1">
+      <w:start w:val="1"/>
+      <w:numFmt w:val="bullet"/>
+      <w:lvlText w:val=""/>
+      <w:lvlJc w:val="left"/>
+      <w:pPr>
+        <w:tabs>
+          <w:tab w:val="num" w:pos="4320"/>
+        </w:tabs>
+        <w:ind w:left="4320" w:hanging="360"/>
+      </w:pPr>
+      <w:rPr>
+        <w:rFonts w:ascii="Wingdings" w:hAnsi="Wingdings" w:hint="default"/>
+        <w:sz w:val="20"/>
+      </w:rPr>
+    </w:lvl>
+    <w:lvl w:ilvl="6" w:tentative="1">
+      <w:start w:val="1"/>
+      <w:numFmt w:val="bullet"/>
+      <w:lvlText w:val=""/>
+      <w:lvlJc w:val="left"/>
+      <w:pPr>
+        <w:tabs>
+          <w:tab w:val="num" w:pos="5040"/>
+        </w:tabs>
+        <w:ind w:left="5040" w:hanging="360"/>
+      </w:pPr>
+      <w:rPr>
+        <w:rFonts w:ascii="Wingdings" w:hAnsi="Wingdings" w:hint="default"/>
+        <w:sz w:val="20"/>
+      </w:rPr>
+    </w:lvl>
+    <w:lvl w:ilvl="7" w:tentative="1">
+      <w:start w:val="1"/>
+      <w:numFmt w:val="bullet"/>
+      <w:lvlText w:val=""/>
+      <w:lvlJc w:val="left"/>
+      <w:pPr>
+        <w:tabs>
+          <w:tab w:val="num" w:pos="5760"/>
+        </w:tabs>
+        <w:ind w:left="5760" w:hanging="360"/>
+      </w:pPr>
+      <w:rPr>
+        <w:rFonts w:ascii="Wingdings" w:hAnsi="Wingdings" w:hint="default"/>
+        <w:sz w:val="20"/>
+      </w:rPr>
+    </w:lvl>
+    <w:lvl w:ilvl="8" w:tentative="1">
+      <w:start w:val="1"/>
+      <w:numFmt w:val="bullet"/>
+      <w:lvlText w:val=""/>
+      <w:lvlJc w:val="left"/>
+      <w:pPr>
+        <w:tabs>
+          <w:tab w:val="num" w:pos="6480"/>
+        </w:tabs>
+        <w:ind w:left="6480" w:hanging="360"/>
+      </w:pPr>
+      <w:rPr>
+        <w:rFonts w:ascii="Wingdings" w:hAnsi="Wingdings" w:hint="default"/>
+        <w:sz w:val="20"/>
+      </w:rPr>
+    </w:lvl>
+  </w:abstractNum>
+  <w:abstractNum w:abstractNumId="3" w15:restartNumberingAfterBreak="0">
+    <w:nsid w:val="29571BCD"/>
+    <w:multiLevelType w:val="multilevel"/>
+    <w:tmpl w:val="760AF494"/>
+    <w:lvl w:ilvl="0">
+      <w:start w:val="1"/>
+      <w:numFmt w:val="bullet"/>
+      <w:lvlText w:val=""/>
+      <w:lvlJc w:val="left"/>
+      <w:pPr>
+        <w:tabs>
+          <w:tab w:val="num" w:pos="720"/>
+        </w:tabs>
+        <w:ind w:left="720" w:hanging="360"/>
+      </w:pPr>
+      <w:rPr>
+        <w:rFonts w:ascii="Symbol" w:hAnsi="Symbol" w:hint="default"/>
+        <w:sz w:val="20"/>
+      </w:rPr>
+    </w:lvl>
+    <w:lvl w:ilvl="1" w:tentative="1">
+      <w:start w:val="1"/>
+      <w:numFmt w:val="bullet"/>
+      <w:lvlText w:val="o"/>
+      <w:lvlJc w:val="left"/>
+      <w:pPr>
+        <w:tabs>
+          <w:tab w:val="num" w:pos="1440"/>
+        </w:tabs>
+        <w:ind w:left="1440" w:hanging="360"/>
+      </w:pPr>
+      <w:rPr>
+        <w:rFonts w:ascii="Courier New" w:hAnsi="Courier New" w:hint="default"/>
+        <w:sz w:val="20"/>
+      </w:rPr>
+    </w:lvl>
+    <w:lvl w:ilvl="2" w:tentative="1">
+      <w:start w:val="1"/>
+      <w:numFmt w:val="bullet"/>
+      <w:lvlText w:val=""/>
+      <w:lvlJc w:val="left"/>
+      <w:pPr>
+        <w:tabs>
+          <w:tab w:val="num" w:pos="2160"/>
+        </w:tabs>
+        <w:ind w:left="2160" w:hanging="360"/>
+      </w:pPr>
+      <w:rPr>
+        <w:rFonts w:ascii="Wingdings" w:hAnsi="Wingdings" w:hint="default"/>
+        <w:sz w:val="20"/>
+      </w:rPr>
+    </w:lvl>
+    <w:lvl w:ilvl="3" w:tentative="1">
+      <w:start w:val="1"/>
+      <w:numFmt w:val="bullet"/>
+      <w:lvlText w:val=""/>
+      <w:lvlJc w:val="left"/>
+      <w:pPr>
+        <w:tabs>
+          <w:tab w:val="num" w:pos="2880"/>
+        </w:tabs>
+        <w:ind w:left="2880" w:hanging="360"/>
+      </w:pPr>
+      <w:rPr>
+        <w:rFonts w:ascii="Wingdings" w:hAnsi="Wingdings" w:hint="default"/>
+        <w:sz w:val="20"/>
+      </w:rPr>
+    </w:lvl>
+    <w:lvl w:ilvl="4" w:tentative="1">
+      <w:start w:val="1"/>
+      <w:numFmt w:val="bullet"/>
+      <w:lvlText w:val=""/>
+      <w:lvlJc w:val="left"/>
+      <w:pPr>
+        <w:tabs>
+          <w:tab w:val="num" w:pos="3600"/>
+        </w:tabs>
+        <w:ind w:left="3600" w:hanging="360"/>
+      </w:pPr>
+      <w:rPr>
+        <w:rFonts w:ascii="Wingdings" w:hAnsi="Wingdings" w:hint="default"/>
+        <w:sz w:val="20"/>
+      </w:rPr>
+    </w:lvl>
+    <w:lvl w:ilvl="5" w:tentative="1">
+      <w:start w:val="1"/>
+      <w:numFmt w:val="bullet"/>
+      <w:lvlText w:val=""/>
+      <w:lvlJc w:val="left"/>
+      <w:pPr>
+        <w:tabs>
+          <w:tab w:val="num" w:pos="4320"/>
+        </w:tabs>
+        <w:ind w:left="4320" w:hanging="360"/>
+      </w:pPr>
+      <w:rPr>
+        <w:rFonts w:ascii="Wingdings" w:hAnsi="Wingdings" w:hint="default"/>
+        <w:sz w:val="20"/>
+      </w:rPr>
+    </w:lvl>
+    <w:lvl w:ilvl="6" w:tentative="1">
+      <w:start w:val="1"/>
+      <w:numFmt w:val="bullet"/>
+      <w:lvlText w:val=""/>
+      <w:lvlJc w:val="left"/>
+      <w:pPr>
+        <w:tabs>
+          <w:tab w:val="num" w:pos="5040"/>
+        </w:tabs>
+        <w:ind w:left="5040" w:hanging="360"/>
+      </w:pPr>
+      <w:rPr>
+        <w:rFonts w:ascii="Wingdings" w:hAnsi="Wingdings" w:hint="default"/>
+        <w:sz w:val="20"/>
+      </w:rPr>
+    </w:lvl>
+    <w:lvl w:ilvl="7" w:tentative="1">
+      <w:start w:val="1"/>
+      <w:numFmt w:val="bullet"/>
+      <w:lvlText w:val=""/>
+      <w:lvlJc w:val="left"/>
+      <w:pPr>
+        <w:tabs>
+          <w:tab w:val="num" w:pos="5760"/>
+        </w:tabs>
+        <w:ind w:left="5760" w:hanging="360"/>
+      </w:pPr>
+      <w:rPr>
+        <w:rFonts w:ascii="Wingdings" w:hAnsi="Wingdings" w:hint="default"/>
+        <w:sz w:val="20"/>
+      </w:rPr>
+    </w:lvl>
+    <w:lvl w:ilvl="8" w:tentative="1">
+      <w:start w:val="1"/>
+      <w:numFmt w:val="bullet"/>
+      <w:lvlText w:val=""/>
+      <w:lvlJc w:val="left"/>
+      <w:pPr>
+        <w:tabs>
+          <w:tab w:val="num" w:pos="6480"/>
+        </w:tabs>
+        <w:ind w:left="6480" w:hanging="360"/>
+      </w:pPr>
+      <w:rPr>
+        <w:rFonts w:ascii="Wingdings" w:hAnsi="Wingdings" w:hint="default"/>
+        <w:sz w:val="20"/>
+      </w:rPr>
+    </w:lvl>
+  </w:abstractNum>
+  <w:abstractNum w:abstractNumId="4" w15:restartNumberingAfterBreak="0">
+    <w:nsid w:val="2A374CA8"/>
+    <w:multiLevelType w:val="multilevel"/>
+    <w:tmpl w:val="314CAFD6"/>
+    <w:lvl w:ilvl="0">
+      <w:start w:val="1"/>
+      <w:numFmt w:val="bullet"/>
+      <w:lvlText w:val=""/>
+      <w:lvlJc w:val="left"/>
+      <w:pPr>
+        <w:tabs>
+          <w:tab w:val="num" w:pos="720"/>
+        </w:tabs>
+        <w:ind w:left="720" w:hanging="360"/>
+      </w:pPr>
+      <w:rPr>
+        <w:rFonts w:ascii="Symbol" w:hAnsi="Symbol" w:hint="default"/>
+        <w:sz w:val="20"/>
+      </w:rPr>
+    </w:lvl>
+    <w:lvl w:ilvl="1" w:tentative="1">
+      <w:start w:val="1"/>
+      <w:numFmt w:val="bullet"/>
+      <w:lvlText w:val="o"/>
+      <w:lvlJc w:val="left"/>
+      <w:pPr>
+        <w:tabs>
+          <w:tab w:val="num" w:pos="1440"/>
+        </w:tabs>
+        <w:ind w:left="1440" w:hanging="360"/>
+      </w:pPr>
+      <w:rPr>
+        <w:rFonts w:ascii="Courier New" w:hAnsi="Courier New" w:hint="default"/>
+        <w:sz w:val="20"/>
+      </w:rPr>
+    </w:lvl>
+    <w:lvl w:ilvl="2" w:tentative="1">
+      <w:start w:val="1"/>
+      <w:numFmt w:val="bullet"/>
+      <w:lvlText w:val=""/>
+      <w:lvlJc w:val="left"/>
+      <w:pPr>
+        <w:tabs>
+          <w:tab w:val="num" w:pos="2160"/>
+        </w:tabs>
+        <w:ind w:left="2160" w:hanging="360"/>
+      </w:pPr>
+      <w:rPr>
+        <w:rFonts w:ascii="Wingdings" w:hAnsi="Wingdings" w:hint="default"/>
+        <w:sz w:val="20"/>
+      </w:rPr>
+    </w:lvl>
+    <w:lvl w:ilvl="3" w:tentative="1">
+      <w:start w:val="1"/>
+      <w:numFmt w:val="bullet"/>
+      <w:lvlText w:val=""/>
+      <w:lvlJc w:val="left"/>
+      <w:pPr>
+        <w:tabs>
+          <w:tab w:val="num" w:pos="2880"/>
+        </w:tabs>
+        <w:ind w:left="2880" w:hanging="360"/>
+      </w:pPr>
+      <w:rPr>
+        <w:rFonts w:ascii="Wingdings" w:hAnsi="Wingdings" w:hint="default"/>
+        <w:sz w:val="20"/>
+      </w:rPr>
+    </w:lvl>
+    <w:lvl w:ilvl="4" w:tentative="1">
+      <w:start w:val="1"/>
+      <w:numFmt w:val="bullet"/>
+      <w:lvlText w:val=""/>
+      <w:lvlJc w:val="left"/>
+      <w:pPr>
+        <w:tabs>
+          <w:tab w:val="num" w:pos="3600"/>
+        </w:tabs>
+        <w:ind w:left="3600" w:hanging="360"/>
+      </w:pPr>
+      <w:rPr>
+        <w:rFonts w:ascii="Wingdings" w:hAnsi="Wingdings" w:hint="default"/>
+        <w:sz w:val="20"/>
+      </w:rPr>
+    </w:lvl>
+    <w:lvl w:ilvl="5" w:tentative="1">
+      <w:start w:val="1"/>
+      <w:numFmt w:val="bullet"/>
+      <w:lvlText w:val=""/>
+      <w:lvlJc w:val="left"/>
+      <w:pPr>
+        <w:tabs>
+          <w:tab w:val="num" w:pos="4320"/>
+        </w:tabs>
+        <w:ind w:left="4320" w:hanging="360"/>
+      </w:pPr>
+      <w:rPr>
+        <w:rFonts w:ascii="Wingdings" w:hAnsi="Wingdings" w:hint="default"/>
+        <w:sz w:val="20"/>
+      </w:rPr>
+    </w:lvl>
+    <w:lvl w:ilvl="6" w:tentative="1">
+      <w:start w:val="1"/>
+      <w:numFmt w:val="bullet"/>
+      <w:lvlText w:val=""/>
+      <w:lvlJc w:val="left"/>
+      <w:pPr>
+        <w:tabs>
+          <w:tab w:val="num" w:pos="5040"/>
+        </w:tabs>
+        <w:ind w:left="5040" w:hanging="360"/>
+      </w:pPr>
+      <w:rPr>
+        <w:rFonts w:ascii="Wingdings" w:hAnsi="Wingdings" w:hint="default"/>
+        <w:sz w:val="20"/>
+      </w:rPr>
+    </w:lvl>
+    <w:lvl w:ilvl="7" w:tentative="1">
+      <w:start w:val="1"/>
+      <w:numFmt w:val="bullet"/>
+      <w:lvlText w:val=""/>
+      <w:lvlJc w:val="left"/>
+      <w:pPr>
+        <w:tabs>
+          <w:tab w:val="num" w:pos="5760"/>
+        </w:tabs>
+        <w:ind w:left="5760" w:hanging="360"/>
+      </w:pPr>
+      <w:rPr>
+        <w:rFonts w:ascii="Wingdings" w:hAnsi="Wingdings" w:hint="default"/>
+        <w:sz w:val="20"/>
+      </w:rPr>
+    </w:lvl>
+    <w:lvl w:ilvl="8" w:tentative="1">
+      <w:start w:val="1"/>
+      <w:numFmt w:val="bullet"/>
+      <w:lvlText w:val=""/>
+      <w:lvlJc w:val="left"/>
+      <w:pPr>
+        <w:tabs>
+          <w:tab w:val="num" w:pos="6480"/>
+        </w:tabs>
+        <w:ind w:left="6480" w:hanging="360"/>
+      </w:pPr>
+      <w:rPr>
+        <w:rFonts w:ascii="Wingdings" w:hAnsi="Wingdings" w:hint="default"/>
+        <w:sz w:val="20"/>
+      </w:rPr>
+    </w:lvl>
+  </w:abstractNum>
+  <w:abstractNum w:abstractNumId="5" w15:restartNumberingAfterBreak="0">
+    <w:nsid w:val="2B32542A"/>
+    <w:multiLevelType w:val="multilevel"/>
+    <w:tmpl w:val="15E6805A"/>
+    <w:lvl w:ilvl="0">
+      <w:start w:val="1"/>
+      <w:numFmt w:val="bullet"/>
+      <w:lvlText w:val=""/>
+      <w:lvlJc w:val="left"/>
+      <w:pPr>
+        <w:tabs>
+          <w:tab w:val="num" w:pos="720"/>
+        </w:tabs>
+        <w:ind w:left="720" w:hanging="360"/>
+      </w:pPr>
+      <w:rPr>
+        <w:rFonts w:ascii="Symbol" w:hAnsi="Symbol" w:hint="default"/>
+        <w:sz w:val="20"/>
+      </w:rPr>
+    </w:lvl>
+    <w:lvl w:ilvl="1" w:tentative="1">
+      <w:start w:val="1"/>
+      <w:numFmt w:val="bullet"/>
+      <w:lvlText w:val="o"/>
+      <w:lvlJc w:val="left"/>
+      <w:pPr>
+        <w:tabs>
+          <w:tab w:val="num" w:pos="1440"/>
+        </w:tabs>
+        <w:ind w:left="1440" w:hanging="360"/>
+      </w:pPr>
+      <w:rPr>
+        <w:rFonts w:ascii="Courier New" w:hAnsi="Courier New" w:hint="default"/>
+        <w:sz w:val="20"/>
+      </w:rPr>
+    </w:lvl>
+    <w:lvl w:ilvl="2" w:tentative="1">
+      <w:start w:val="1"/>
+      <w:numFmt w:val="bullet"/>
+      <w:lvlText w:val=""/>
+      <w:lvlJc w:val="left"/>
+      <w:pPr>
+        <w:tabs>
+          <w:tab w:val="num" w:pos="2160"/>
+        </w:tabs>
+        <w:ind w:left="2160" w:hanging="360"/>
+      </w:pPr>
+      <w:rPr>
+        <w:rFonts w:ascii="Wingdings" w:hAnsi="Wingdings" w:hint="default"/>
+        <w:sz w:val="20"/>
+      </w:rPr>
+    </w:lvl>
+    <w:lvl w:ilvl="3" w:tentative="1">
+      <w:start w:val="1"/>
+      <w:numFmt w:val="bullet"/>
+      <w:lvlText w:val=""/>
+      <w:lvlJc w:val="left"/>
+      <w:pPr>
+        <w:tabs>
+          <w:tab w:val="num" w:pos="2880"/>
+        </w:tabs>
+        <w:ind w:left="2880" w:hanging="360"/>
+      </w:pPr>
+      <w:rPr>
+        <w:rFonts w:ascii="Wingdings" w:hAnsi="Wingdings" w:hint="default"/>
+        <w:sz w:val="20"/>
+      </w:rPr>
+    </w:lvl>
+    <w:lvl w:ilvl="4" w:tentative="1">
+      <w:start w:val="1"/>
+      <w:numFmt w:val="bullet"/>
+      <w:lvlText w:val=""/>
+      <w:lvlJc w:val="left"/>
+      <w:pPr>
+        <w:tabs>
+          <w:tab w:val="num" w:pos="3600"/>
+        </w:tabs>
+        <w:ind w:left="3600" w:hanging="360"/>
+      </w:pPr>
+      <w:rPr>
+        <w:rFonts w:ascii="Wingdings" w:hAnsi="Wingdings" w:hint="default"/>
+        <w:sz w:val="20"/>
+      </w:rPr>
+    </w:lvl>
+    <w:lvl w:ilvl="5" w:tentative="1">
+      <w:start w:val="1"/>
+      <w:numFmt w:val="bullet"/>
+      <w:lvlText w:val=""/>
+      <w:lvlJc w:val="left"/>
+      <w:pPr>
+        <w:tabs>
+          <w:tab w:val="num" w:pos="4320"/>
+        </w:tabs>
+        <w:ind w:left="4320" w:hanging="360"/>
+      </w:pPr>
+      <w:rPr>
+        <w:rFonts w:ascii="Wingdings" w:hAnsi="Wingdings" w:hint="default"/>
+        <w:sz w:val="20"/>
+      </w:rPr>
+    </w:lvl>
+    <w:lvl w:ilvl="6" w:tentative="1">
+      <w:start w:val="1"/>
+      <w:numFmt w:val="bullet"/>
+      <w:lvlText w:val=""/>
+      <w:lvlJc w:val="left"/>
+      <w:pPr>
+        <w:tabs>
+          <w:tab w:val="num" w:pos="5040"/>
+        </w:tabs>
+        <w:ind w:left="5040" w:hanging="360"/>
+      </w:pPr>
+      <w:rPr>
+        <w:rFonts w:ascii="Wingdings" w:hAnsi="Wingdings" w:hint="default"/>
+        <w:sz w:val="20"/>
+      </w:rPr>
+    </w:lvl>
+    <w:lvl w:ilvl="7" w:tentative="1">
+      <w:start w:val="1"/>
+      <w:numFmt w:val="bullet"/>
+      <w:lvlText w:val=""/>
+      <w:lvlJc w:val="left"/>
+      <w:pPr>
+        <w:tabs>
+          <w:tab w:val="num" w:pos="5760"/>
+        </w:tabs>
+        <w:ind w:left="5760" w:hanging="360"/>
+      </w:pPr>
+      <w:rPr>
+        <w:rFonts w:ascii="Wingdings" w:hAnsi="Wingdings" w:hint="default"/>
+        <w:sz w:val="20"/>
+      </w:rPr>
+    </w:lvl>
+    <w:lvl w:ilvl="8" w:tentative="1">
+      <w:start w:val="1"/>
+      <w:numFmt w:val="bullet"/>
+      <w:lvlText w:val=""/>
+      <w:lvlJc w:val="left"/>
+      <w:pPr>
+        <w:tabs>
+          <w:tab w:val="num" w:pos="6480"/>
+        </w:tabs>
+        <w:ind w:left="6480" w:hanging="360"/>
+      </w:pPr>
+      <w:rPr>
+        <w:rFonts w:ascii="Wingdings" w:hAnsi="Wingdings" w:hint="default"/>
+        <w:sz w:val="20"/>
+      </w:rPr>
+    </w:lvl>
+  </w:abstractNum>
+  <w:abstractNum w:abstractNumId="6" w15:restartNumberingAfterBreak="0">
+    <w:nsid w:val="2E85724F"/>
+    <w:multiLevelType w:val="multilevel"/>
+    <w:tmpl w:val="38C0670E"/>
+    <w:lvl w:ilvl="0">
+      <w:start w:val="1"/>
+      <w:numFmt w:val="bullet"/>
+      <w:lvlText w:val=""/>
+      <w:lvlJc w:val="left"/>
+      <w:pPr>
+        <w:tabs>
+          <w:tab w:val="num" w:pos="720"/>
+        </w:tabs>
+        <w:ind w:left="720" w:hanging="360"/>
+      </w:pPr>
+      <w:rPr>
+        <w:rFonts w:ascii="Symbol" w:hAnsi="Symbol" w:hint="default"/>
+        <w:sz w:val="20"/>
+      </w:rPr>
+    </w:lvl>
+    <w:lvl w:ilvl="1" w:tentative="1">
+      <w:start w:val="1"/>
+      <w:numFmt w:val="bullet"/>
+      <w:lvlText w:val="o"/>
+      <w:lvlJc w:val="left"/>
+      <w:pPr>
+        <w:tabs>
+          <w:tab w:val="num" w:pos="1440"/>
+        </w:tabs>
+        <w:ind w:left="1440" w:hanging="360"/>
+      </w:pPr>
+      <w:rPr>
+        <w:rFonts w:ascii="Courier New" w:hAnsi="Courier New" w:hint="default"/>
+        <w:sz w:val="20"/>
+      </w:rPr>
+    </w:lvl>
+    <w:lvl w:ilvl="2" w:tentative="1">
+      <w:start w:val="1"/>
+      <w:numFmt w:val="bullet"/>
+      <w:lvlText w:val=""/>
+      <w:lvlJc w:val="left"/>
+      <w:pPr>
+        <w:tabs>
+          <w:tab w:val="num" w:pos="2160"/>
+        </w:tabs>
+        <w:ind w:left="2160" w:hanging="360"/>
+      </w:pPr>
+      <w:rPr>
+        <w:rFonts w:ascii="Wingdings" w:hAnsi="Wingdings" w:hint="default"/>
+        <w:sz w:val="20"/>
+      </w:rPr>
+    </w:lvl>
+    <w:lvl w:ilvl="3" w:tentative="1">
+      <w:start w:val="1"/>
+      <w:numFmt w:val="bullet"/>
+      <w:lvlText w:val=""/>
+      <w:lvlJc w:val="left"/>
+      <w:pPr>
+        <w:tabs>
+          <w:tab w:val="num" w:pos="2880"/>
+        </w:tabs>
+        <w:ind w:left="2880" w:hanging="360"/>
+      </w:pPr>
+      <w:rPr>
+        <w:rFonts w:ascii="Wingdings" w:hAnsi="Wingdings" w:hint="default"/>
+        <w:sz w:val="20"/>
+      </w:rPr>
+    </w:lvl>
+    <w:lvl w:ilvl="4" w:tentative="1">
+      <w:start w:val="1"/>
+      <w:numFmt w:val="bullet"/>
+      <w:lvlText w:val=""/>
+      <w:lvlJc w:val="left"/>
+      <w:pPr>
+        <w:tabs>
+          <w:tab w:val="num" w:pos="3600"/>
+        </w:tabs>
+        <w:ind w:left="3600" w:hanging="360"/>
+      </w:pPr>
+      <w:rPr>
+        <w:rFonts w:ascii="Wingdings" w:hAnsi="Wingdings" w:hint="default"/>
+        <w:sz w:val="20"/>
+      </w:rPr>
+    </w:lvl>
+    <w:lvl w:ilvl="5" w:tentative="1">
+      <w:start w:val="1"/>
+      <w:numFmt w:val="bullet"/>
+      <w:lvlText w:val=""/>
+      <w:lvlJc w:val="left"/>
+      <w:pPr>
+        <w:tabs>
+          <w:tab w:val="num" w:pos="4320"/>
+        </w:tabs>
+        <w:ind w:left="4320" w:hanging="360"/>
+      </w:pPr>
+      <w:rPr>
+        <w:rFonts w:ascii="Wingdings" w:hAnsi="Wingdings" w:hint="default"/>
+        <w:sz w:val="20"/>
+      </w:rPr>
+    </w:lvl>
+    <w:lvl w:ilvl="6" w:tentative="1">
+      <w:start w:val="1"/>
+      <w:numFmt w:val="bullet"/>
+      <w:lvlText w:val=""/>
+      <w:lvlJc w:val="left"/>
+      <w:pPr>
+        <w:tabs>
+          <w:tab w:val="num" w:pos="5040"/>
+        </w:tabs>
+        <w:ind w:left="5040" w:hanging="360"/>
+      </w:pPr>
+      <w:rPr>
+        <w:rFonts w:ascii="Wingdings" w:hAnsi="Wingdings" w:hint="default"/>
+        <w:sz w:val="20"/>
+      </w:rPr>
+    </w:lvl>
+    <w:lvl w:ilvl="7" w:tentative="1">
+      <w:start w:val="1"/>
+      <w:numFmt w:val="bullet"/>
+      <w:lvlText w:val=""/>
+      <w:lvlJc w:val="left"/>
+      <w:pPr>
+        <w:tabs>
+          <w:tab w:val="num" w:pos="5760"/>
+        </w:tabs>
+        <w:ind w:left="5760" w:hanging="360"/>
+      </w:pPr>
+      <w:rPr>
+        <w:rFonts w:ascii="Wingdings" w:hAnsi="Wingdings" w:hint="default"/>
+        <w:sz w:val="20"/>
+      </w:rPr>
+    </w:lvl>
+    <w:lvl w:ilvl="8" w:tentative="1">
+      <w:start w:val="1"/>
+      <w:numFmt w:val="bullet"/>
+      <w:lvlText w:val=""/>
+      <w:lvlJc w:val="left"/>
+      <w:pPr>
+        <w:tabs>
+          <w:tab w:val="num" w:pos="6480"/>
+        </w:tabs>
+        <w:ind w:left="6480" w:hanging="360"/>
+      </w:pPr>
+      <w:rPr>
+        <w:rFonts w:ascii="Wingdings" w:hAnsi="Wingdings" w:hint="default"/>
+        <w:sz w:val="20"/>
+      </w:rPr>
+    </w:lvl>
+  </w:abstractNum>
+  <w:abstractNum w:abstractNumId="7" w15:restartNumberingAfterBreak="0">
+    <w:nsid w:val="358201D4"/>
+    <w:multiLevelType w:val="multilevel"/>
+    <w:tmpl w:val="92566A68"/>
+    <w:lvl w:ilvl="0">
+      <w:start w:val="1"/>
+      <w:numFmt w:val="bullet"/>
+      <w:lvlText w:val=""/>
+      <w:lvlJc w:val="left"/>
+      <w:pPr>
+        <w:tabs>
+          <w:tab w:val="num" w:pos="720"/>
+        </w:tabs>
+        <w:ind w:left="720" w:hanging="360"/>
+      </w:pPr>
+      <w:rPr>
+        <w:rFonts w:ascii="Symbol" w:hAnsi="Symbol" w:hint="default"/>
+        <w:sz w:val="20"/>
+      </w:rPr>
+    </w:lvl>
+    <w:lvl w:ilvl="1" w:tentative="1">
+      <w:start w:val="1"/>
+      <w:numFmt w:val="bullet"/>
+      <w:lvlText w:val="o"/>
+      <w:lvlJc w:val="left"/>
+      <w:pPr>
+        <w:tabs>
+          <w:tab w:val="num" w:pos="1440"/>
+        </w:tabs>
+        <w:ind w:left="1440" w:hanging="360"/>
+      </w:pPr>
+      <w:rPr>
+        <w:rFonts w:ascii="Courier New" w:hAnsi="Courier New" w:hint="default"/>
+        <w:sz w:val="20"/>
+      </w:rPr>
+    </w:lvl>
+    <w:lvl w:ilvl="2" w:tentative="1">
+      <w:start w:val="1"/>
+      <w:numFmt w:val="bullet"/>
+      <w:lvlText w:val=""/>
+      <w:lvlJc w:val="left"/>
+      <w:pPr>
+        <w:tabs>
+          <w:tab w:val="num" w:pos="2160"/>
+        </w:tabs>
+        <w:ind w:left="2160" w:hanging="360"/>
+      </w:pPr>
+      <w:rPr>
+        <w:rFonts w:ascii="Wingdings" w:hAnsi="Wingdings" w:hint="default"/>
+        <w:sz w:val="20"/>
+      </w:rPr>
+    </w:lvl>
+    <w:lvl w:ilvl="3" w:tentative="1">
+      <w:start w:val="1"/>
+      <w:numFmt w:val="bullet"/>
+      <w:lvlText w:val=""/>
+      <w:lvlJc w:val="left"/>
+      <w:pPr>
+        <w:tabs>
+          <w:tab w:val="num" w:pos="2880"/>
+        </w:tabs>
+        <w:ind w:left="2880" w:hanging="360"/>
+      </w:pPr>
+      <w:rPr>
+        <w:rFonts w:ascii="Wingdings" w:hAnsi="Wingdings" w:hint="default"/>
+        <w:sz w:val="20"/>
+      </w:rPr>
+    </w:lvl>
+    <w:lvl w:ilvl="4" w:tentative="1">
+      <w:start w:val="1"/>
+      <w:numFmt w:val="bullet"/>
+      <w:lvlText w:val=""/>
+      <w:lvlJc w:val="left"/>
+      <w:pPr>
+        <w:tabs>
+          <w:tab w:val="num" w:pos="3600"/>
+        </w:tabs>
+        <w:ind w:left="3600" w:hanging="360"/>
+      </w:pPr>
+      <w:rPr>
+        <w:rFonts w:ascii="Wingdings" w:hAnsi="Wingdings" w:hint="default"/>
+        <w:sz w:val="20"/>
+      </w:rPr>
+    </w:lvl>
+    <w:lvl w:ilvl="5" w:tentative="1">
+      <w:start w:val="1"/>
+      <w:numFmt w:val="bullet"/>
+      <w:lvlText w:val=""/>
+      <w:lvlJc w:val="left"/>
+      <w:pPr>
+        <w:tabs>
+          <w:tab w:val="num" w:pos="4320"/>
+        </w:tabs>
+        <w:ind w:left="4320" w:hanging="360"/>
+      </w:pPr>
+      <w:rPr>
+        <w:rFonts w:ascii="Wingdings" w:hAnsi="Wingdings" w:hint="default"/>
+        <w:sz w:val="20"/>
+      </w:rPr>
+    </w:lvl>
+    <w:lvl w:ilvl="6" w:tentative="1">
+      <w:start w:val="1"/>
+      <w:numFmt w:val="bullet"/>
+      <w:lvlText w:val=""/>
+      <w:lvlJc w:val="left"/>
+      <w:pPr>
+        <w:tabs>
+          <w:tab w:val="num" w:pos="5040"/>
+        </w:tabs>
+        <w:ind w:left="5040" w:hanging="360"/>
+      </w:pPr>
+      <w:rPr>
+        <w:rFonts w:ascii="Wingdings" w:hAnsi="Wingdings" w:hint="default"/>
+        <w:sz w:val="20"/>
+      </w:rPr>
+    </w:lvl>
+    <w:lvl w:ilvl="7" w:tentative="1">
+      <w:start w:val="1"/>
+      <w:numFmt w:val="bullet"/>
+      <w:lvlText w:val=""/>
+      <w:lvlJc w:val="left"/>
+      <w:pPr>
+        <w:tabs>
+          <w:tab w:val="num" w:pos="5760"/>
+        </w:tabs>
+        <w:ind w:left="5760" w:hanging="360"/>
+      </w:pPr>
+      <w:rPr>
+        <w:rFonts w:ascii="Wingdings" w:hAnsi="Wingdings" w:hint="default"/>
+        <w:sz w:val="20"/>
+      </w:rPr>
+    </w:lvl>
+    <w:lvl w:ilvl="8" w:tentative="1">
+      <w:start w:val="1"/>
+      <w:numFmt w:val="bullet"/>
+      <w:lvlText w:val=""/>
+      <w:lvlJc w:val="left"/>
+      <w:pPr>
+        <w:tabs>
+          <w:tab w:val="num" w:pos="6480"/>
+        </w:tabs>
+        <w:ind w:left="6480" w:hanging="360"/>
+      </w:pPr>
+      <w:rPr>
+        <w:rFonts w:ascii="Wingdings" w:hAnsi="Wingdings" w:hint="default"/>
+        <w:sz w:val="20"/>
+      </w:rPr>
+    </w:lvl>
+  </w:abstractNum>
+  <w:abstractNum w:abstractNumId="8" w15:restartNumberingAfterBreak="0">
+    <w:nsid w:val="36964AD1"/>
+    <w:multiLevelType w:val="multilevel"/>
+    <w:tmpl w:val="0AFA5328"/>
+    <w:lvl w:ilvl="0">
+      <w:start w:val="1"/>
+      <w:numFmt w:val="bullet"/>
+      <w:lvlText w:val=""/>
+      <w:lvlJc w:val="left"/>
+      <w:pPr>
+        <w:tabs>
+          <w:tab w:val="num" w:pos="720"/>
+        </w:tabs>
+        <w:ind w:left="720" w:hanging="360"/>
+      </w:pPr>
+      <w:rPr>
+        <w:rFonts w:ascii="Symbol" w:hAnsi="Symbol" w:hint="default"/>
+        <w:sz w:val="20"/>
+      </w:rPr>
+    </w:lvl>
+    <w:lvl w:ilvl="1" w:tentative="1">
+      <w:start w:val="1"/>
+      <w:numFmt w:val="bullet"/>
+      <w:lvlText w:val="o"/>
+      <w:lvlJc w:val="left"/>
+      <w:pPr>
+        <w:tabs>
+          <w:tab w:val="num" w:pos="1440"/>
+        </w:tabs>
+        <w:ind w:left="1440" w:hanging="360"/>
+      </w:pPr>
+      <w:rPr>
+        <w:rFonts w:ascii="Courier New" w:hAnsi="Courier New" w:hint="default"/>
+        <w:sz w:val="20"/>
+      </w:rPr>
+    </w:lvl>
+    <w:lvl w:ilvl="2" w:tentative="1">
+      <w:start w:val="1"/>
+      <w:numFmt w:val="bullet"/>
+      <w:lvlText w:val=""/>
+      <w:lvlJc w:val="left"/>
+      <w:pPr>
+        <w:tabs>
+          <w:tab w:val="num" w:pos="2160"/>
+        </w:tabs>
+        <w:ind w:left="2160" w:hanging="360"/>
+      </w:pPr>
+      <w:rPr>
+        <w:rFonts w:ascii="Wingdings" w:hAnsi="Wingdings" w:hint="default"/>
+        <w:sz w:val="20"/>
+      </w:rPr>
+    </w:lvl>
+    <w:lvl w:ilvl="3" w:tentative="1">
+      <w:start w:val="1"/>
+      <w:numFmt w:val="bullet"/>
+      <w:lvlText w:val=""/>
+      <w:lvlJc w:val="left"/>
+      <w:pPr>
+        <w:tabs>
+          <w:tab w:val="num" w:pos="2880"/>
+        </w:tabs>
+        <w:ind w:left="2880" w:hanging="360"/>
+      </w:pPr>
+      <w:rPr>
+        <w:rFonts w:ascii="Wingdings" w:hAnsi="Wingdings" w:hint="default"/>
+        <w:sz w:val="20"/>
+      </w:rPr>
+    </w:lvl>
+    <w:lvl w:ilvl="4" w:tentative="1">
+      <w:start w:val="1"/>
+      <w:numFmt w:val="bullet"/>
+      <w:lvlText w:val=""/>
+      <w:lvlJc w:val="left"/>
+      <w:pPr>
+        <w:tabs>
+          <w:tab w:val="num" w:pos="3600"/>
+        </w:tabs>
+        <w:ind w:left="3600" w:hanging="360"/>
+      </w:pPr>
+      <w:rPr>
+        <w:rFonts w:ascii="Wingdings" w:hAnsi="Wingdings" w:hint="default"/>
+        <w:sz w:val="20"/>
+      </w:rPr>
+    </w:lvl>
+    <w:lvl w:ilvl="5" w:tentative="1">
+      <w:start w:val="1"/>
+      <w:numFmt w:val="bullet"/>
+      <w:lvlText w:val=""/>
+      <w:lvlJc w:val="left"/>
+      <w:pPr>
+        <w:tabs>
+          <w:tab w:val="num" w:pos="4320"/>
+        </w:tabs>
+        <w:ind w:left="4320" w:hanging="360"/>
+      </w:pPr>
+      <w:rPr>
+        <w:rFonts w:ascii="Wingdings" w:hAnsi="Wingdings" w:hint="default"/>
+        <w:sz w:val="20"/>
+      </w:rPr>
+    </w:lvl>
+    <w:lvl w:ilvl="6" w:tentative="1">
+      <w:start w:val="1"/>
+      <w:numFmt w:val="bullet"/>
+      <w:lvlText w:val=""/>
+      <w:lvlJc w:val="left"/>
+      <w:pPr>
+        <w:tabs>
+          <w:tab w:val="num" w:pos="5040"/>
+        </w:tabs>
+        <w:ind w:left="5040" w:hanging="360"/>
+      </w:pPr>
+      <w:rPr>
+        <w:rFonts w:ascii="Wingdings" w:hAnsi="Wingdings" w:hint="default"/>
+        <w:sz w:val="20"/>
+      </w:rPr>
+    </w:lvl>
+    <w:lvl w:ilvl="7" w:tentative="1">
+      <w:start w:val="1"/>
+      <w:numFmt w:val="bullet"/>
+      <w:lvlText w:val=""/>
+      <w:lvlJc w:val="left"/>
+      <w:pPr>
+        <w:tabs>
+          <w:tab w:val="num" w:pos="5760"/>
+        </w:tabs>
+        <w:ind w:left="5760" w:hanging="360"/>
+      </w:pPr>
+      <w:rPr>
+        <w:rFonts w:ascii="Wingdings" w:hAnsi="Wingdings" w:hint="default"/>
+        <w:sz w:val="20"/>
+      </w:rPr>
+    </w:lvl>
+    <w:lvl w:ilvl="8" w:tentative="1">
+      <w:start w:val="1"/>
+      <w:numFmt w:val="bullet"/>
+      <w:lvlText w:val=""/>
+      <w:lvlJc w:val="left"/>
+      <w:pPr>
+        <w:tabs>
+          <w:tab w:val="num" w:pos="6480"/>
+        </w:tabs>
+        <w:ind w:left="6480" w:hanging="360"/>
+      </w:pPr>
+      <w:rPr>
+        <w:rFonts w:ascii="Wingdings" w:hAnsi="Wingdings" w:hint="default"/>
+        <w:sz w:val="20"/>
+      </w:rPr>
+    </w:lvl>
+  </w:abstractNum>
+  <w:abstractNum w:abstractNumId="9" w15:restartNumberingAfterBreak="0">
+    <w:nsid w:val="41EC3044"/>
+    <w:multiLevelType w:val="multilevel"/>
+    <w:tmpl w:val="B9F21646"/>
+    <w:lvl w:ilvl="0">
+      <w:start w:val="1"/>
+      <w:numFmt w:val="bullet"/>
+      <w:lvlText w:val=""/>
+      <w:lvlJc w:val="left"/>
+      <w:pPr>
+        <w:tabs>
+          <w:tab w:val="num" w:pos="720"/>
+        </w:tabs>
+        <w:ind w:left="720" w:hanging="360"/>
+      </w:pPr>
+      <w:rPr>
+        <w:rFonts w:ascii="Symbol" w:hAnsi="Symbol" w:hint="default"/>
+        <w:sz w:val="20"/>
+      </w:rPr>
+    </w:lvl>
+    <w:lvl w:ilvl="1" w:tentative="1">
+      <w:start w:val="1"/>
+      <w:numFmt w:val="bullet"/>
+      <w:lvlText w:val="o"/>
+      <w:lvlJc w:val="left"/>
+      <w:pPr>
+        <w:tabs>
+          <w:tab w:val="num" w:pos="1440"/>
+        </w:tabs>
+        <w:ind w:left="1440" w:hanging="360"/>
+      </w:pPr>
+      <w:rPr>
+        <w:rFonts w:ascii="Courier New" w:hAnsi="Courier New" w:hint="default"/>
+        <w:sz w:val="20"/>
+      </w:rPr>
+    </w:lvl>
+    <w:lvl w:ilvl="2" w:tentative="1">
+      <w:start w:val="1"/>
+      <w:numFmt w:val="bullet"/>
+      <w:lvlText w:val=""/>
+      <w:lvlJc w:val="left"/>
+      <w:pPr>
+        <w:tabs>
+          <w:tab w:val="num" w:pos="2160"/>
+        </w:tabs>
+        <w:ind w:left="2160" w:hanging="360"/>
+      </w:pPr>
+      <w:rPr>
+        <w:rFonts w:ascii="Wingdings" w:hAnsi="Wingdings" w:hint="default"/>
+        <w:sz w:val="20"/>
+      </w:rPr>
+    </w:lvl>
+    <w:lvl w:ilvl="3" w:tentative="1">
+      <w:start w:val="1"/>
+      <w:numFmt w:val="bullet"/>
+      <w:lvlText w:val=""/>
+      <w:lvlJc w:val="left"/>
+      <w:pPr>
+        <w:tabs>
+          <w:tab w:val="num" w:pos="2880"/>
+        </w:tabs>
+        <w:ind w:left="2880" w:hanging="360"/>
+      </w:pPr>
+      <w:rPr>
+        <w:rFonts w:ascii="Wingdings" w:hAnsi="Wingdings" w:hint="default"/>
+        <w:sz w:val="20"/>
+      </w:rPr>
+    </w:lvl>
+    <w:lvl w:ilvl="4" w:tentative="1">
+      <w:start w:val="1"/>
+      <w:numFmt w:val="bullet"/>
+      <w:lvlText w:val=""/>
+      <w:lvlJc w:val="left"/>
+      <w:pPr>
+        <w:tabs>
+          <w:tab w:val="num" w:pos="3600"/>
+        </w:tabs>
+        <w:ind w:left="3600" w:hanging="360"/>
+      </w:pPr>
+      <w:rPr>
+        <w:rFonts w:ascii="Wingdings" w:hAnsi="Wingdings" w:hint="default"/>
+        <w:sz w:val="20"/>
+      </w:rPr>
+    </w:lvl>
+    <w:lvl w:ilvl="5" w:tentative="1">
+      <w:start w:val="1"/>
+      <w:numFmt w:val="bullet"/>
+      <w:lvlText w:val=""/>
+      <w:lvlJc w:val="left"/>
+      <w:pPr>
+        <w:tabs>
+          <w:tab w:val="num" w:pos="4320"/>
+        </w:tabs>
+        <w:ind w:left="4320" w:hanging="360"/>
+      </w:pPr>
+      <w:rPr>
+        <w:rFonts w:ascii="Wingdings" w:hAnsi="Wingdings" w:hint="default"/>
+        <w:sz w:val="20"/>
+      </w:rPr>
+    </w:lvl>
+    <w:lvl w:ilvl="6" w:tentative="1">
+      <w:start w:val="1"/>
+      <w:numFmt w:val="bullet"/>
+      <w:lvlText w:val=""/>
+      <w:lvlJc w:val="left"/>
+      <w:pPr>
+        <w:tabs>
+          <w:tab w:val="num" w:pos="5040"/>
+        </w:tabs>
+        <w:ind w:left="5040" w:hanging="360"/>
+      </w:pPr>
+      <w:rPr>
+        <w:rFonts w:ascii="Wingdings" w:hAnsi="Wingdings" w:hint="default"/>
+        <w:sz w:val="20"/>
+      </w:rPr>
+    </w:lvl>
+    <w:lvl w:ilvl="7" w:tentative="1">
+      <w:start w:val="1"/>
+      <w:numFmt w:val="bullet"/>
+      <w:lvlText w:val=""/>
+      <w:lvlJc w:val="left"/>
+      <w:pPr>
+        <w:tabs>
+          <w:tab w:val="num" w:pos="5760"/>
+        </w:tabs>
+        <w:ind w:left="5760" w:hanging="360"/>
+      </w:pPr>
+      <w:rPr>
+        <w:rFonts w:ascii="Wingdings" w:hAnsi="Wingdings" w:hint="default"/>
+        <w:sz w:val="20"/>
+      </w:rPr>
+    </w:lvl>
+    <w:lvl w:ilvl="8" w:tentative="1">
+      <w:start w:val="1"/>
+      <w:numFmt w:val="bullet"/>
+      <w:lvlText w:val=""/>
+      <w:lvlJc w:val="left"/>
+      <w:pPr>
+        <w:tabs>
+          <w:tab w:val="num" w:pos="6480"/>
+        </w:tabs>
+        <w:ind w:left="6480" w:hanging="360"/>
+      </w:pPr>
+      <w:rPr>
+        <w:rFonts w:ascii="Wingdings" w:hAnsi="Wingdings" w:hint="default"/>
+        <w:sz w:val="20"/>
+      </w:rPr>
+    </w:lvl>
+  </w:abstractNum>
+  <w:abstractNum w:abstractNumId="10" w15:restartNumberingAfterBreak="0">
+    <w:nsid w:val="47D56784"/>
+    <w:multiLevelType w:val="multilevel"/>
+    <w:tmpl w:val="E21E1C58"/>
+    <w:lvl w:ilvl="0">
+      <w:start w:val="1"/>
+      <w:numFmt w:val="bullet"/>
+      <w:lvlText w:val=""/>
+      <w:lvlJc w:val="left"/>
+      <w:pPr>
+        <w:tabs>
+          <w:tab w:val="num" w:pos="720"/>
+        </w:tabs>
+        <w:ind w:left="720" w:hanging="360"/>
+      </w:pPr>
+      <w:rPr>
+        <w:rFonts w:ascii="Symbol" w:hAnsi="Symbol" w:hint="default"/>
+        <w:sz w:val="20"/>
+      </w:rPr>
+    </w:lvl>
+    <w:lvl w:ilvl="1" w:tentative="1">
+      <w:start w:val="1"/>
+      <w:numFmt w:val="bullet"/>
+      <w:lvlText w:val="o"/>
+      <w:lvlJc w:val="left"/>
+      <w:pPr>
+        <w:tabs>
+          <w:tab w:val="num" w:pos="1440"/>
+        </w:tabs>
+        <w:ind w:left="1440" w:hanging="360"/>
+      </w:pPr>
+      <w:rPr>
+        <w:rFonts w:ascii="Courier New" w:hAnsi="Courier New" w:hint="default"/>
+        <w:sz w:val="20"/>
+      </w:rPr>
+    </w:lvl>
+    <w:lvl w:ilvl="2" w:tentative="1">
+      <w:start w:val="1"/>
+      <w:numFmt w:val="bullet"/>
+      <w:lvlText w:val=""/>
+      <w:lvlJc w:val="left"/>
+      <w:pPr>
+        <w:tabs>
+          <w:tab w:val="num" w:pos="2160"/>
+        </w:tabs>
+        <w:ind w:left="2160" w:hanging="360"/>
+      </w:pPr>
+      <w:rPr>
+        <w:rFonts w:ascii="Wingdings" w:hAnsi="Wingdings" w:hint="default"/>
+        <w:sz w:val="20"/>
+      </w:rPr>
+    </w:lvl>
+    <w:lvl w:ilvl="3" w:tentative="1">
+      <w:start w:val="1"/>
+      <w:numFmt w:val="bullet"/>
+      <w:lvlText w:val=""/>
+      <w:lvlJc w:val="left"/>
+      <w:pPr>
+        <w:tabs>
+          <w:tab w:val="num" w:pos="2880"/>
+        </w:tabs>
+        <w:ind w:left="2880" w:hanging="360"/>
+      </w:pPr>
+      <w:rPr>
+        <w:rFonts w:ascii="Wingdings" w:hAnsi="Wingdings" w:hint="default"/>
+        <w:sz w:val="20"/>
+      </w:rPr>
+    </w:lvl>
+    <w:lvl w:ilvl="4" w:tentative="1">
+      <w:start w:val="1"/>
+      <w:numFmt w:val="bullet"/>
+      <w:lvlText w:val=""/>
+      <w:lvlJc w:val="left"/>
+      <w:pPr>
+        <w:tabs>
+          <w:tab w:val="num" w:pos="3600"/>
+        </w:tabs>
+        <w:ind w:left="3600" w:hanging="360"/>
+      </w:pPr>
+      <w:rPr>
+        <w:rFonts w:ascii="Wingdings" w:hAnsi="Wingdings" w:hint="default"/>
+        <w:sz w:val="20"/>
+      </w:rPr>
+    </w:lvl>
+    <w:lvl w:ilvl="5" w:tentative="1">
+      <w:start w:val="1"/>
+      <w:numFmt w:val="bullet"/>
+      <w:lvlText w:val=""/>
+      <w:lvlJc w:val="left"/>
+      <w:pPr>
+        <w:tabs>
+          <w:tab w:val="num" w:pos="4320"/>
+        </w:tabs>
+        <w:ind w:left="4320" w:hanging="360"/>
+      </w:pPr>
+      <w:rPr>
+        <w:rFonts w:ascii="Wingdings" w:hAnsi="Wingdings" w:hint="default"/>
+        <w:sz w:val="20"/>
+      </w:rPr>
+    </w:lvl>
+    <w:lvl w:ilvl="6" w:tentative="1">
+      <w:start w:val="1"/>
+      <w:numFmt w:val="bullet"/>
+      <w:lvlText w:val=""/>
+      <w:lvlJc w:val="left"/>
+      <w:pPr>
+        <w:tabs>
+          <w:tab w:val="num" w:pos="5040"/>
+        </w:tabs>
+        <w:ind w:left="5040" w:hanging="360"/>
+      </w:pPr>
+      <w:rPr>
+        <w:rFonts w:ascii="Wingdings" w:hAnsi="Wingdings" w:hint="default"/>
+        <w:sz w:val="20"/>
+      </w:rPr>
+    </w:lvl>
+    <w:lvl w:ilvl="7" w:tentative="1">
+      <w:start w:val="1"/>
+      <w:numFmt w:val="bullet"/>
+      <w:lvlText w:val=""/>
+      <w:lvlJc w:val="left"/>
+      <w:pPr>
+        <w:tabs>
+          <w:tab w:val="num" w:pos="5760"/>
+        </w:tabs>
+        <w:ind w:left="5760" w:hanging="360"/>
+      </w:pPr>
+      <w:rPr>
+        <w:rFonts w:ascii="Wingdings" w:hAnsi="Wingdings" w:hint="default"/>
+        <w:sz w:val="20"/>
+      </w:rPr>
+    </w:lvl>
+    <w:lvl w:ilvl="8" w:tentative="1">
+      <w:start w:val="1"/>
+      <w:numFmt w:val="bullet"/>
+      <w:lvlText w:val=""/>
+      <w:lvlJc w:val="left"/>
+      <w:pPr>
+        <w:tabs>
+          <w:tab w:val="num" w:pos="6480"/>
+        </w:tabs>
+        <w:ind w:left="6480" w:hanging="360"/>
+      </w:pPr>
+      <w:rPr>
+        <w:rFonts w:ascii="Wingdings" w:hAnsi="Wingdings" w:hint="default"/>
+        <w:sz w:val="20"/>
+      </w:rPr>
+    </w:lvl>
+  </w:abstractNum>
+  <w:abstractNum w:abstractNumId="11" w15:restartNumberingAfterBreak="0">
+    <w:nsid w:val="4A1A15DE"/>
+    <w:multiLevelType w:val="multilevel"/>
+    <w:tmpl w:val="D9D8F422"/>
+    <w:lvl w:ilvl="0">
+      <w:start w:val="1"/>
+      <w:numFmt w:val="bullet"/>
+      <w:lvlText w:val=""/>
+      <w:lvlJc w:val="left"/>
+      <w:pPr>
+        <w:tabs>
+          <w:tab w:val="num" w:pos="720"/>
+        </w:tabs>
+        <w:ind w:left="720" w:hanging="360"/>
+      </w:pPr>
+      <w:rPr>
+        <w:rFonts w:ascii="Symbol" w:hAnsi="Symbol" w:hint="default"/>
+        <w:sz w:val="20"/>
+      </w:rPr>
+    </w:lvl>
+    <w:lvl w:ilvl="1" w:tentative="1">
+      <w:start w:val="1"/>
+      <w:numFmt w:val="bullet"/>
+      <w:lvlText w:val="o"/>
+      <w:lvlJc w:val="left"/>
+      <w:pPr>
+        <w:tabs>
+          <w:tab w:val="num" w:pos="1440"/>
+        </w:tabs>
+        <w:ind w:left="1440" w:hanging="360"/>
+      </w:pPr>
+      <w:rPr>
+        <w:rFonts w:ascii="Courier New" w:hAnsi="Courier New" w:hint="default"/>
+        <w:sz w:val="20"/>
+      </w:rPr>
+    </w:lvl>
+    <w:lvl w:ilvl="2" w:tentative="1">
+      <w:start w:val="1"/>
+      <w:numFmt w:val="bullet"/>
+      <w:lvlText w:val=""/>
+      <w:lvlJc w:val="left"/>
+      <w:pPr>
+        <w:tabs>
+          <w:tab w:val="num" w:pos="2160"/>
+        </w:tabs>
+        <w:ind w:left="2160" w:hanging="360"/>
+      </w:pPr>
+      <w:rPr>
+        <w:rFonts w:ascii="Wingdings" w:hAnsi="Wingdings" w:hint="default"/>
+        <w:sz w:val="20"/>
+      </w:rPr>
+    </w:lvl>
+    <w:lvl w:ilvl="3" w:tentative="1">
+      <w:start w:val="1"/>
+      <w:numFmt w:val="bullet"/>
+      <w:lvlText w:val=""/>
+      <w:lvlJc w:val="left"/>
+      <w:pPr>
+        <w:tabs>
+          <w:tab w:val="num" w:pos="2880"/>
+        </w:tabs>
+        <w:ind w:left="2880" w:hanging="360"/>
+      </w:pPr>
+      <w:rPr>
+        <w:rFonts w:ascii="Wingdings" w:hAnsi="Wingdings" w:hint="default"/>
+        <w:sz w:val="20"/>
+      </w:rPr>
+    </w:lvl>
+    <w:lvl w:ilvl="4" w:tentative="1">
+      <w:start w:val="1"/>
+      <w:numFmt w:val="bullet"/>
+      <w:lvlText w:val=""/>
+      <w:lvlJc w:val="left"/>
+      <w:pPr>
+        <w:tabs>
+          <w:tab w:val="num" w:pos="3600"/>
+        </w:tabs>
+        <w:ind w:left="3600" w:hanging="360"/>
+      </w:pPr>
+      <w:rPr>
+        <w:rFonts w:ascii="Wingdings" w:hAnsi="Wingdings" w:hint="default"/>
+        <w:sz w:val="20"/>
+      </w:rPr>
+    </w:lvl>
+    <w:lvl w:ilvl="5" w:tentative="1">
+      <w:start w:val="1"/>
+      <w:numFmt w:val="bullet"/>
+      <w:lvlText w:val=""/>
+      <w:lvlJc w:val="left"/>
+      <w:pPr>
+        <w:tabs>
+          <w:tab w:val="num" w:pos="4320"/>
+        </w:tabs>
+        <w:ind w:left="4320" w:hanging="360"/>
+      </w:pPr>
+      <w:rPr>
+        <w:rFonts w:ascii="Wingdings" w:hAnsi="Wingdings" w:hint="default"/>
+        <w:sz w:val="20"/>
+      </w:rPr>
+    </w:lvl>
+    <w:lvl w:ilvl="6" w:tentative="1">
+      <w:start w:val="1"/>
+      <w:numFmt w:val="bullet"/>
+      <w:lvlText w:val=""/>
+      <w:lvlJc w:val="left"/>
+      <w:pPr>
+        <w:tabs>
+          <w:tab w:val="num" w:pos="5040"/>
+        </w:tabs>
+        <w:ind w:left="5040" w:hanging="360"/>
+      </w:pPr>
+      <w:rPr>
+        <w:rFonts w:ascii="Wingdings" w:hAnsi="Wingdings" w:hint="default"/>
+        <w:sz w:val="20"/>
+      </w:rPr>
+    </w:lvl>
+    <w:lvl w:ilvl="7" w:tentative="1">
+      <w:start w:val="1"/>
+      <w:numFmt w:val="bullet"/>
+      <w:lvlText w:val=""/>
+      <w:lvlJc w:val="left"/>
+      <w:pPr>
+        <w:tabs>
+          <w:tab w:val="num" w:pos="5760"/>
+        </w:tabs>
+        <w:ind w:left="5760" w:hanging="360"/>
+      </w:pPr>
+      <w:rPr>
+        <w:rFonts w:ascii="Wingdings" w:hAnsi="Wingdings" w:hint="default"/>
+        <w:sz w:val="20"/>
+      </w:rPr>
+    </w:lvl>
+    <w:lvl w:ilvl="8" w:tentative="1">
+      <w:start w:val="1"/>
+      <w:numFmt w:val="bullet"/>
+      <w:lvlText w:val=""/>
+      <w:lvlJc w:val="left"/>
+      <w:pPr>
+        <w:tabs>
+          <w:tab w:val="num" w:pos="6480"/>
+        </w:tabs>
+        <w:ind w:left="6480" w:hanging="360"/>
+      </w:pPr>
+      <w:rPr>
+        <w:rFonts w:ascii="Wingdings" w:hAnsi="Wingdings" w:hint="default"/>
+        <w:sz w:val="20"/>
+      </w:rPr>
+    </w:lvl>
+  </w:abstractNum>
+  <w:abstractNum w:abstractNumId="12" w15:restartNumberingAfterBreak="0">
+    <w:nsid w:val="502010A8"/>
+    <w:multiLevelType w:val="multilevel"/>
+    <w:tmpl w:val="4532F8A6"/>
+    <w:lvl w:ilvl="0">
+      <w:start w:val="1"/>
+      <w:numFmt w:val="bullet"/>
+      <w:lvlText w:val=""/>
+      <w:lvlJc w:val="left"/>
+      <w:pPr>
+        <w:tabs>
+          <w:tab w:val="num" w:pos="720"/>
+        </w:tabs>
+        <w:ind w:left="720" w:hanging="360"/>
+      </w:pPr>
+      <w:rPr>
+        <w:rFonts w:ascii="Symbol" w:hAnsi="Symbol" w:hint="default"/>
+        <w:sz w:val="20"/>
+      </w:rPr>
+    </w:lvl>
+    <w:lvl w:ilvl="1" w:tentative="1">
+      <w:start w:val="1"/>
+      <w:numFmt w:val="bullet"/>
+      <w:lvlText w:val="o"/>
+      <w:lvlJc w:val="left"/>
+      <w:pPr>
+        <w:tabs>
+          <w:tab w:val="num" w:pos="1440"/>
+        </w:tabs>
+        <w:ind w:left="1440" w:hanging="360"/>
+      </w:pPr>
+      <w:rPr>
+        <w:rFonts w:ascii="Courier New" w:hAnsi="Courier New" w:hint="default"/>
+        <w:sz w:val="20"/>
+      </w:rPr>
+    </w:lvl>
+    <w:lvl w:ilvl="2" w:tentative="1">
+      <w:start w:val="1"/>
+      <w:numFmt w:val="bullet"/>
+      <w:lvlText w:val=""/>
+      <w:lvlJc w:val="left"/>
+      <w:pPr>
+        <w:tabs>
+          <w:tab w:val="num" w:pos="2160"/>
+        </w:tabs>
+        <w:ind w:left="2160" w:hanging="360"/>
+      </w:pPr>
+      <w:rPr>
+        <w:rFonts w:ascii="Wingdings" w:hAnsi="Wingdings" w:hint="default"/>
+        <w:sz w:val="20"/>
+      </w:rPr>
+    </w:lvl>
+    <w:lvl w:ilvl="3" w:tentative="1">
+      <w:start w:val="1"/>
+      <w:numFmt w:val="bullet"/>
+      <w:lvlText w:val=""/>
+      <w:lvlJc w:val="left"/>
+      <w:pPr>
+        <w:tabs>
+          <w:tab w:val="num" w:pos="2880"/>
+        </w:tabs>
+        <w:ind w:left="2880" w:hanging="360"/>
+      </w:pPr>
+      <w:rPr>
+        <w:rFonts w:ascii="Wingdings" w:hAnsi="Wingdings" w:hint="default"/>
+        <w:sz w:val="20"/>
+      </w:rPr>
+    </w:lvl>
+    <w:lvl w:ilvl="4" w:tentative="1">
+      <w:start w:val="1"/>
+      <w:numFmt w:val="bullet"/>
+      <w:lvlText w:val=""/>
+      <w:lvlJc w:val="left"/>
+      <w:pPr>
+        <w:tabs>
+          <w:tab w:val="num" w:pos="3600"/>
+        </w:tabs>
+        <w:ind w:left="3600" w:hanging="360"/>
+      </w:pPr>
+      <w:rPr>
+        <w:rFonts w:ascii="Wingdings" w:hAnsi="Wingdings" w:hint="default"/>
+        <w:sz w:val="20"/>
+      </w:rPr>
+    </w:lvl>
+    <w:lvl w:ilvl="5" w:tentative="1">
+      <w:start w:val="1"/>
+      <w:numFmt w:val="bullet"/>
+      <w:lvlText w:val=""/>
+      <w:lvlJc w:val="left"/>
+      <w:pPr>
+        <w:tabs>
+          <w:tab w:val="num" w:pos="4320"/>
+        </w:tabs>
+        <w:ind w:left="4320" w:hanging="360"/>
+      </w:pPr>
+      <w:rPr>
+        <w:rFonts w:ascii="Wingdings" w:hAnsi="Wingdings" w:hint="default"/>
+        <w:sz w:val="20"/>
+      </w:rPr>
+    </w:lvl>
+    <w:lvl w:ilvl="6" w:tentative="1">
+      <w:start w:val="1"/>
+      <w:numFmt w:val="bullet"/>
+      <w:lvlText w:val=""/>
+      <w:lvlJc w:val="left"/>
+      <w:pPr>
+        <w:tabs>
+          <w:tab w:val="num" w:pos="5040"/>
+        </w:tabs>
+        <w:ind w:left="5040" w:hanging="360"/>
+      </w:pPr>
+      <w:rPr>
+        <w:rFonts w:ascii="Wingdings" w:hAnsi="Wingdings" w:hint="default"/>
+        <w:sz w:val="20"/>
+      </w:rPr>
+    </w:lvl>
+    <w:lvl w:ilvl="7" w:tentative="1">
+      <w:start w:val="1"/>
+      <w:numFmt w:val="bullet"/>
+      <w:lvlText w:val=""/>
+      <w:lvlJc w:val="left"/>
+      <w:pPr>
+        <w:tabs>
+          <w:tab w:val="num" w:pos="5760"/>
+        </w:tabs>
+        <w:ind w:left="5760" w:hanging="360"/>
+      </w:pPr>
+      <w:rPr>
+        <w:rFonts w:ascii="Wingdings" w:hAnsi="Wingdings" w:hint="default"/>
+        <w:sz w:val="20"/>
+      </w:rPr>
+    </w:lvl>
+    <w:lvl w:ilvl="8" w:tentative="1">
+      <w:start w:val="1"/>
+      <w:numFmt w:val="bullet"/>
+      <w:lvlText w:val=""/>
+      <w:lvlJc w:val="left"/>
+      <w:pPr>
+        <w:tabs>
+          <w:tab w:val="num" w:pos="6480"/>
+        </w:tabs>
+        <w:ind w:left="6480" w:hanging="360"/>
+      </w:pPr>
+      <w:rPr>
+        <w:rFonts w:ascii="Wingdings" w:hAnsi="Wingdings" w:hint="default"/>
+        <w:sz w:val="20"/>
+      </w:rPr>
+    </w:lvl>
+  </w:abstractNum>
+  <w:abstractNum w:abstractNumId="13" w15:restartNumberingAfterBreak="0">
+    <w:nsid w:val="5A816005"/>
+    <w:multiLevelType w:val="multilevel"/>
+    <w:tmpl w:val="B4D28CAE"/>
+    <w:lvl w:ilvl="0">
+      <w:start w:val="1"/>
+      <w:numFmt w:val="bullet"/>
+      <w:lvlText w:val=""/>
+      <w:lvlJc w:val="left"/>
+      <w:pPr>
+        <w:tabs>
+          <w:tab w:val="num" w:pos="720"/>
+        </w:tabs>
+        <w:ind w:left="720" w:hanging="360"/>
+      </w:pPr>
+      <w:rPr>
+        <w:rFonts w:ascii="Symbol" w:hAnsi="Symbol" w:hint="default"/>
+        <w:sz w:val="20"/>
+      </w:rPr>
+    </w:lvl>
+    <w:lvl w:ilvl="1" w:tentative="1">
+      <w:start w:val="1"/>
+      <w:numFmt w:val="bullet"/>
+      <w:lvlText w:val="o"/>
+      <w:lvlJc w:val="left"/>
+      <w:pPr>
+        <w:tabs>
+          <w:tab w:val="num" w:pos="1440"/>
+        </w:tabs>
+        <w:ind w:left="1440" w:hanging="360"/>
+      </w:pPr>
+      <w:rPr>
+        <w:rFonts w:ascii="Courier New" w:hAnsi="Courier New" w:hint="default"/>
+        <w:sz w:val="20"/>
+      </w:rPr>
+    </w:lvl>
+    <w:lvl w:ilvl="2" w:tentative="1">
+      <w:start w:val="1"/>
+      <w:numFmt w:val="bullet"/>
+      <w:lvlText w:val=""/>
+      <w:lvlJc w:val="left"/>
+      <w:pPr>
+        <w:tabs>
+          <w:tab w:val="num" w:pos="2160"/>
+        </w:tabs>
+        <w:ind w:left="2160" w:hanging="360"/>
+      </w:pPr>
+      <w:rPr>
+        <w:rFonts w:ascii="Wingdings" w:hAnsi="Wingdings" w:hint="default"/>
+        <w:sz w:val="20"/>
+      </w:rPr>
+    </w:lvl>
+    <w:lvl w:ilvl="3" w:tentative="1">
+      <w:start w:val="1"/>
+      <w:numFmt w:val="bullet"/>
+      <w:lvlText w:val=""/>
+      <w:lvlJc w:val="left"/>
+      <w:pPr>
+        <w:tabs>
+          <w:tab w:val="num" w:pos="2880"/>
+        </w:tabs>
+        <w:ind w:left="2880" w:hanging="360"/>
+      </w:pPr>
+      <w:rPr>
+        <w:rFonts w:ascii="Wingdings" w:hAnsi="Wingdings" w:hint="default"/>
+        <w:sz w:val="20"/>
+      </w:rPr>
+    </w:lvl>
+    <w:lvl w:ilvl="4" w:tentative="1">
+      <w:start w:val="1"/>
+      <w:numFmt w:val="bullet"/>
+      <w:lvlText w:val=""/>
+      <w:lvlJc w:val="left"/>
+      <w:pPr>
+        <w:tabs>
+          <w:tab w:val="num" w:pos="3600"/>
+        </w:tabs>
+        <w:ind w:left="3600" w:hanging="360"/>
+      </w:pPr>
+      <w:rPr>
+        <w:rFonts w:ascii="Wingdings" w:hAnsi="Wingdings" w:hint="default"/>
+        <w:sz w:val="20"/>
+      </w:rPr>
+    </w:lvl>
+    <w:lvl w:ilvl="5" w:tentative="1">
+      <w:start w:val="1"/>
+      <w:numFmt w:val="bullet"/>
+      <w:lvlText w:val=""/>
+      <w:lvlJc w:val="left"/>
+      <w:pPr>
+        <w:tabs>
+          <w:tab w:val="num" w:pos="4320"/>
+        </w:tabs>
+        <w:ind w:left="4320" w:hanging="360"/>
+      </w:pPr>
+      <w:rPr>
+        <w:rFonts w:ascii="Wingdings" w:hAnsi="Wingdings" w:hint="default"/>
+        <w:sz w:val="20"/>
+      </w:rPr>
+    </w:lvl>
+    <w:lvl w:ilvl="6" w:tentative="1">
+      <w:start w:val="1"/>
+      <w:numFmt w:val="bullet"/>
+      <w:lvlText w:val=""/>
+      <w:lvlJc w:val="left"/>
+      <w:pPr>
+        <w:tabs>
+          <w:tab w:val="num" w:pos="5040"/>
+        </w:tabs>
+        <w:ind w:left="5040" w:hanging="360"/>
+      </w:pPr>
+      <w:rPr>
+        <w:rFonts w:ascii="Wingdings" w:hAnsi="Wingdings" w:hint="default"/>
+        <w:sz w:val="20"/>
+      </w:rPr>
+    </w:lvl>
+    <w:lvl w:ilvl="7" w:tentative="1">
+      <w:start w:val="1"/>
+      <w:numFmt w:val="bullet"/>
+      <w:lvlText w:val=""/>
+      <w:lvlJc w:val="left"/>
+      <w:pPr>
+        <w:tabs>
+          <w:tab w:val="num" w:pos="5760"/>
+        </w:tabs>
+        <w:ind w:left="5760" w:hanging="360"/>
+      </w:pPr>
+      <w:rPr>
+        <w:rFonts w:ascii="Wingdings" w:hAnsi="Wingdings" w:hint="default"/>
+        <w:sz w:val="20"/>
+      </w:rPr>
+    </w:lvl>
+    <w:lvl w:ilvl="8" w:tentative="1">
+      <w:start w:val="1"/>
+      <w:numFmt w:val="bullet"/>
+      <w:lvlText w:val=""/>
+      <w:lvlJc w:val="left"/>
+      <w:pPr>
+        <w:tabs>
+          <w:tab w:val="num" w:pos="6480"/>
+        </w:tabs>
+        <w:ind w:left="6480" w:hanging="360"/>
+      </w:pPr>
+      <w:rPr>
+        <w:rFonts w:ascii="Wingdings" w:hAnsi="Wingdings" w:hint="default"/>
+        <w:sz w:val="20"/>
+      </w:rPr>
+    </w:lvl>
+  </w:abstractNum>
+  <w:abstractNum w:abstractNumId="14" w15:restartNumberingAfterBreak="0">
+    <w:nsid w:val="5FFE4BD9"/>
+    <w:multiLevelType w:val="multilevel"/>
+    <w:tmpl w:val="08CCCB3C"/>
+    <w:lvl w:ilvl="0">
+      <w:start w:val="1"/>
+      <w:numFmt w:val="bullet"/>
+      <w:lvlText w:val=""/>
+      <w:lvlJc w:val="left"/>
+      <w:pPr>
+        <w:tabs>
+          <w:tab w:val="num" w:pos="720"/>
+        </w:tabs>
+        <w:ind w:left="720" w:hanging="360"/>
+      </w:pPr>
+      <w:rPr>
+        <w:rFonts w:ascii="Symbol" w:hAnsi="Symbol" w:hint="default"/>
+        <w:sz w:val="20"/>
+      </w:rPr>
+    </w:lvl>
+    <w:lvl w:ilvl="1" w:tentative="1">
+      <w:start w:val="1"/>
+      <w:numFmt w:val="bullet"/>
+      <w:lvlText w:val="o"/>
+      <w:lvlJc w:val="left"/>
+      <w:pPr>
+        <w:tabs>
+          <w:tab w:val="num" w:pos="1440"/>
+        </w:tabs>
+        <w:ind w:left="1440" w:hanging="360"/>
+      </w:pPr>
+      <w:rPr>
+        <w:rFonts w:ascii="Courier New" w:hAnsi="Courier New" w:hint="default"/>
+        <w:sz w:val="20"/>
+      </w:rPr>
+    </w:lvl>
+    <w:lvl w:ilvl="2" w:tentative="1">
+      <w:start w:val="1"/>
+      <w:numFmt w:val="bullet"/>
+      <w:lvlText w:val=""/>
+      <w:lvlJc w:val="left"/>
+      <w:pPr>
+        <w:tabs>
+          <w:tab w:val="num" w:pos="2160"/>
+        </w:tabs>
+        <w:ind w:left="2160" w:hanging="360"/>
+      </w:pPr>
+      <w:rPr>
+        <w:rFonts w:ascii="Wingdings" w:hAnsi="Wingdings" w:hint="default"/>
+        <w:sz w:val="20"/>
+      </w:rPr>
+    </w:lvl>
+    <w:lvl w:ilvl="3" w:tentative="1">
+      <w:start w:val="1"/>
+      <w:numFmt w:val="bullet"/>
+      <w:lvlText w:val=""/>
+      <w:lvlJc w:val="left"/>
+      <w:pPr>
+        <w:tabs>
+          <w:tab w:val="num" w:pos="2880"/>
+        </w:tabs>
+        <w:ind w:left="2880" w:hanging="360"/>
+      </w:pPr>
+      <w:rPr>
+        <w:rFonts w:ascii="Wingdings" w:hAnsi="Wingdings" w:hint="default"/>
+        <w:sz w:val="20"/>
+      </w:rPr>
+    </w:lvl>
+    <w:lvl w:ilvl="4" w:tentative="1">
+      <w:start w:val="1"/>
+      <w:numFmt w:val="bullet"/>
+      <w:lvlText w:val=""/>
+      <w:lvlJc w:val="left"/>
+      <w:pPr>
+        <w:tabs>
+          <w:tab w:val="num" w:pos="3600"/>
+        </w:tabs>
+        <w:ind w:left="3600" w:hanging="360"/>
+      </w:pPr>
+      <w:rPr>
+        <w:rFonts w:ascii="Wingdings" w:hAnsi="Wingdings" w:hint="default"/>
+        <w:sz w:val="20"/>
+      </w:rPr>
+    </w:lvl>
+    <w:lvl w:ilvl="5" w:tentative="1">
+      <w:start w:val="1"/>
+      <w:numFmt w:val="bullet"/>
+      <w:lvlText w:val=""/>
+      <w:lvlJc w:val="left"/>
+      <w:pPr>
+        <w:tabs>
+          <w:tab w:val="num" w:pos="4320"/>
+        </w:tabs>
+        <w:ind w:left="4320" w:hanging="360"/>
+      </w:pPr>
+      <w:rPr>
+        <w:rFonts w:ascii="Wingdings" w:hAnsi="Wingdings" w:hint="default"/>
+        <w:sz w:val="20"/>
+      </w:rPr>
+    </w:lvl>
+    <w:lvl w:ilvl="6" w:tentative="1">
+      <w:start w:val="1"/>
+      <w:numFmt w:val="bullet"/>
+      <w:lvlText w:val=""/>
+      <w:lvlJc w:val="left"/>
+      <w:pPr>
+        <w:tabs>
+          <w:tab w:val="num" w:pos="5040"/>
+        </w:tabs>
+        <w:ind w:left="5040" w:hanging="360"/>
+      </w:pPr>
+      <w:rPr>
+        <w:rFonts w:ascii="Wingdings" w:hAnsi="Wingdings" w:hint="default"/>
+        <w:sz w:val="20"/>
+      </w:rPr>
+    </w:lvl>
+    <w:lvl w:ilvl="7" w:tentative="1">
+      <w:start w:val="1"/>
+      <w:numFmt w:val="bullet"/>
+      <w:lvlText w:val=""/>
+      <w:lvlJc w:val="left"/>
+      <w:pPr>
+        <w:tabs>
+          <w:tab w:val="num" w:pos="5760"/>
+        </w:tabs>
+        <w:ind w:left="5760" w:hanging="360"/>
+      </w:pPr>
+      <w:rPr>
+        <w:rFonts w:ascii="Wingdings" w:hAnsi="Wingdings" w:hint="default"/>
+        <w:sz w:val="20"/>
+      </w:rPr>
+    </w:lvl>
+    <w:lvl w:ilvl="8" w:tentative="1">
+      <w:start w:val="1"/>
+      <w:numFmt w:val="bullet"/>
+      <w:lvlText w:val=""/>
+      <w:lvlJc w:val="left"/>
+      <w:pPr>
+        <w:tabs>
+          <w:tab w:val="num" w:pos="6480"/>
+        </w:tabs>
+        <w:ind w:left="6480" w:hanging="360"/>
+      </w:pPr>
+      <w:rPr>
+        <w:rFonts w:ascii="Wingdings" w:hAnsi="Wingdings" w:hint="default"/>
+        <w:sz w:val="20"/>
+      </w:rPr>
+    </w:lvl>
+  </w:abstractNum>
+  <w:abstractNum w:abstractNumId="15" w15:restartNumberingAfterBreak="0">
+    <w:nsid w:val="655A78FD"/>
+    <w:multiLevelType w:val="multilevel"/>
+    <w:tmpl w:val="91FAA3F0"/>
+    <w:lvl w:ilvl="0">
+      <w:start w:val="1"/>
+      <w:numFmt w:val="bullet"/>
+      <w:lvlText w:val=""/>
+      <w:lvlJc w:val="left"/>
+      <w:pPr>
+        <w:tabs>
+          <w:tab w:val="num" w:pos="720"/>
+        </w:tabs>
+        <w:ind w:left="720" w:hanging="360"/>
+      </w:pPr>
+      <w:rPr>
+        <w:rFonts w:ascii="Symbol" w:hAnsi="Symbol" w:hint="default"/>
+        <w:sz w:val="20"/>
+      </w:rPr>
+    </w:lvl>
+    <w:lvl w:ilvl="1" w:tentative="1">
+      <w:start w:val="1"/>
+      <w:numFmt w:val="bullet"/>
+      <w:lvlText w:val="o"/>
+      <w:lvlJc w:val="left"/>
+      <w:pPr>
+        <w:tabs>
+          <w:tab w:val="num" w:pos="1440"/>
+        </w:tabs>
+        <w:ind w:left="1440" w:hanging="360"/>
+      </w:pPr>
+      <w:rPr>
+        <w:rFonts w:ascii="Courier New" w:hAnsi="Courier New" w:hint="default"/>
+        <w:sz w:val="20"/>
+      </w:rPr>
+    </w:lvl>
+    <w:lvl w:ilvl="2" w:tentative="1">
+      <w:start w:val="1"/>
+      <w:numFmt w:val="bullet"/>
+      <w:lvlText w:val=""/>
+      <w:lvlJc w:val="left"/>
+      <w:pPr>
+        <w:tabs>
+          <w:tab w:val="num" w:pos="2160"/>
+        </w:tabs>
+        <w:ind w:left="2160" w:hanging="360"/>
+      </w:pPr>
+      <w:rPr>
+        <w:rFonts w:ascii="Wingdings" w:hAnsi="Wingdings" w:hint="default"/>
+        <w:sz w:val="20"/>
+      </w:rPr>
+    </w:lvl>
+    <w:lvl w:ilvl="3" w:tentative="1">
+      <w:start w:val="1"/>
+      <w:numFmt w:val="bullet"/>
+      <w:lvlText w:val=""/>
+      <w:lvlJc w:val="left"/>
+      <w:pPr>
+        <w:tabs>
+          <w:tab w:val="num" w:pos="2880"/>
+        </w:tabs>
+        <w:ind w:left="2880" w:hanging="360"/>
+      </w:pPr>
+      <w:rPr>
+        <w:rFonts w:ascii="Wingdings" w:hAnsi="Wingdings" w:hint="default"/>
+        <w:sz w:val="20"/>
+      </w:rPr>
+    </w:lvl>
+    <w:lvl w:ilvl="4" w:tentative="1">
+      <w:start w:val="1"/>
+      <w:numFmt w:val="bullet"/>
+      <w:lvlText w:val=""/>
+      <w:lvlJc w:val="left"/>
+      <w:pPr>
+        <w:tabs>
+          <w:tab w:val="num" w:pos="3600"/>
+        </w:tabs>
+        <w:ind w:left="3600" w:hanging="360"/>
+      </w:pPr>
+      <w:rPr>
+        <w:rFonts w:ascii="Wingdings" w:hAnsi="Wingdings" w:hint="default"/>
+        <w:sz w:val="20"/>
+      </w:rPr>
+    </w:lvl>
+    <w:lvl w:ilvl="5" w:tentative="1">
+      <w:start w:val="1"/>
+      <w:numFmt w:val="bullet"/>
+      <w:lvlText w:val=""/>
+      <w:lvlJc w:val="left"/>
+      <w:pPr>
+        <w:tabs>
+          <w:tab w:val="num" w:pos="4320"/>
+        </w:tabs>
+        <w:ind w:left="4320" w:hanging="360"/>
+      </w:pPr>
+      <w:rPr>
+        <w:rFonts w:ascii="Wingdings" w:hAnsi="Wingdings" w:hint="default"/>
+        <w:sz w:val="20"/>
+      </w:rPr>
+    </w:lvl>
+    <w:lvl w:ilvl="6" w:tentative="1">
+      <w:start w:val="1"/>
+      <w:numFmt w:val="bullet"/>
+      <w:lvlText w:val=""/>
+      <w:lvlJc w:val="left"/>
+      <w:pPr>
+        <w:tabs>
+          <w:tab w:val="num" w:pos="5040"/>
+        </w:tabs>
+        <w:ind w:left="5040" w:hanging="360"/>
+      </w:pPr>
+      <w:rPr>
+        <w:rFonts w:ascii="Wingdings" w:hAnsi="Wingdings" w:hint="default"/>
+        <w:sz w:val="20"/>
+      </w:rPr>
+    </w:lvl>
+    <w:lvl w:ilvl="7" w:tentative="1">
+      <w:start w:val="1"/>
+      <w:numFmt w:val="bullet"/>
+      <w:lvlText w:val=""/>
+      <w:lvlJc w:val="left"/>
+      <w:pPr>
+        <w:tabs>
+          <w:tab w:val="num" w:pos="5760"/>
+        </w:tabs>
+        <w:ind w:left="5760" w:hanging="360"/>
+      </w:pPr>
+      <w:rPr>
+        <w:rFonts w:ascii="Wingdings" w:hAnsi="Wingdings" w:hint="default"/>
+        <w:sz w:val="20"/>
+      </w:rPr>
+    </w:lvl>
+    <w:lvl w:ilvl="8" w:tentative="1">
+      <w:start w:val="1"/>
+      <w:numFmt w:val="bullet"/>
+      <w:lvlText w:val=""/>
+      <w:lvlJc w:val="left"/>
+      <w:pPr>
+        <w:tabs>
+          <w:tab w:val="num" w:pos="6480"/>
+        </w:tabs>
+        <w:ind w:left="6480" w:hanging="360"/>
+      </w:pPr>
+      <w:rPr>
+        <w:rFonts w:ascii="Wingdings" w:hAnsi="Wingdings" w:hint="default"/>
+        <w:sz w:val="20"/>
+      </w:rPr>
+    </w:lvl>
+  </w:abstractNum>
+  <w:abstractNum w:abstractNumId="16" w15:restartNumberingAfterBreak="0">
+    <w:nsid w:val="685023E0"/>
+    <w:multiLevelType w:val="multilevel"/>
+    <w:tmpl w:val="2306E284"/>
+    <w:lvl w:ilvl="0">
+      <w:start w:val="1"/>
+      <w:numFmt w:val="bullet"/>
+      <w:lvlText w:val=""/>
+      <w:lvlJc w:val="left"/>
+      <w:pPr>
+        <w:tabs>
+          <w:tab w:val="num" w:pos="720"/>
+        </w:tabs>
+        <w:ind w:left="720" w:hanging="360"/>
+      </w:pPr>
+      <w:rPr>
+        <w:rFonts w:ascii="Symbol" w:hAnsi="Symbol" w:hint="default"/>
+        <w:sz w:val="20"/>
+      </w:rPr>
+    </w:lvl>
+    <w:lvl w:ilvl="1" w:tentative="1">
+      <w:start w:val="1"/>
+      <w:numFmt w:val="bullet"/>
+      <w:lvlText w:val="o"/>
+      <w:lvlJc w:val="left"/>
+      <w:pPr>
+        <w:tabs>
+          <w:tab w:val="num" w:pos="1440"/>
+        </w:tabs>
+        <w:ind w:left="1440" w:hanging="360"/>
+      </w:pPr>
+      <w:rPr>
+        <w:rFonts w:ascii="Courier New" w:hAnsi="Courier New" w:hint="default"/>
+        <w:sz w:val="20"/>
+      </w:rPr>
+    </w:lvl>
+    <w:lvl w:ilvl="2" w:tentative="1">
+      <w:start w:val="1"/>
+      <w:numFmt w:val="bullet"/>
+      <w:lvlText w:val=""/>
+      <w:lvlJc w:val="left"/>
+      <w:pPr>
+        <w:tabs>
+          <w:tab w:val="num" w:pos="2160"/>
+        </w:tabs>
+        <w:ind w:left="2160" w:hanging="360"/>
+      </w:pPr>
+      <w:rPr>
+        <w:rFonts w:ascii="Wingdings" w:hAnsi="Wingdings" w:hint="default"/>
+        <w:sz w:val="20"/>
+      </w:rPr>
+    </w:lvl>
+    <w:lvl w:ilvl="3" w:tentative="1">
+      <w:start w:val="1"/>
+      <w:numFmt w:val="bullet"/>
+      <w:lvlText w:val=""/>
+      <w:lvlJc w:val="left"/>
+      <w:pPr>
+        <w:tabs>
+          <w:tab w:val="num" w:pos="2880"/>
+        </w:tabs>
+        <w:ind w:left="2880" w:hanging="360"/>
+      </w:pPr>
+      <w:rPr>
+        <w:rFonts w:ascii="Wingdings" w:hAnsi="Wingdings" w:hint="default"/>
+        <w:sz w:val="20"/>
+      </w:rPr>
+    </w:lvl>
+    <w:lvl w:ilvl="4" w:tentative="1">
+      <w:start w:val="1"/>
+      <w:numFmt w:val="bullet"/>
+      <w:lvlText w:val=""/>
+      <w:lvlJc w:val="left"/>
+      <w:pPr>
+        <w:tabs>
+          <w:tab w:val="num" w:pos="3600"/>
+        </w:tabs>
+        <w:ind w:left="3600" w:hanging="360"/>
+      </w:pPr>
+      <w:rPr>
+        <w:rFonts w:ascii="Wingdings" w:hAnsi="Wingdings" w:hint="default"/>
+        <w:sz w:val="20"/>
+      </w:rPr>
+    </w:lvl>
+    <w:lvl w:ilvl="5" w:tentative="1">
+      <w:start w:val="1"/>
+      <w:numFmt w:val="bullet"/>
+      <w:lvlText w:val=""/>
+      <w:lvlJc w:val="left"/>
+      <w:pPr>
+        <w:tabs>
+          <w:tab w:val="num" w:pos="4320"/>
+        </w:tabs>
+        <w:ind w:left="4320" w:hanging="360"/>
+      </w:pPr>
+      <w:rPr>
+        <w:rFonts w:ascii="Wingdings" w:hAnsi="Wingdings" w:hint="default"/>
+        <w:sz w:val="20"/>
+      </w:rPr>
+    </w:lvl>
+    <w:lvl w:ilvl="6" w:tentative="1">
+      <w:start w:val="1"/>
+      <w:numFmt w:val="bullet"/>
+      <w:lvlText w:val=""/>
+      <w:lvlJc w:val="left"/>
+      <w:pPr>
+        <w:tabs>
+          <w:tab w:val="num" w:pos="5040"/>
+        </w:tabs>
+        <w:ind w:left="5040" w:hanging="360"/>
+      </w:pPr>
+      <w:rPr>
+        <w:rFonts w:ascii="Wingdings" w:hAnsi="Wingdings" w:hint="default"/>
+        <w:sz w:val="20"/>
+      </w:rPr>
+    </w:lvl>
+    <w:lvl w:ilvl="7" w:tentative="1">
+      <w:start w:val="1"/>
+      <w:numFmt w:val="bullet"/>
+      <w:lvlText w:val=""/>
+      <w:lvlJc w:val="left"/>
+      <w:pPr>
+        <w:tabs>
+          <w:tab w:val="num" w:pos="5760"/>
+        </w:tabs>
+        <w:ind w:left="5760" w:hanging="360"/>
+      </w:pPr>
+      <w:rPr>
+        <w:rFonts w:ascii="Wingdings" w:hAnsi="Wingdings" w:hint="default"/>
+        <w:sz w:val="20"/>
+      </w:rPr>
+    </w:lvl>
+    <w:lvl w:ilvl="8" w:tentative="1">
+      <w:start w:val="1"/>
+      <w:numFmt w:val="bullet"/>
+      <w:lvlText w:val=""/>
+      <w:lvlJc w:val="left"/>
+      <w:pPr>
+        <w:tabs>
+          <w:tab w:val="num" w:pos="6480"/>
+        </w:tabs>
+        <w:ind w:left="6480" w:hanging="360"/>
+      </w:pPr>
+      <w:rPr>
+        <w:rFonts w:ascii="Wingdings" w:hAnsi="Wingdings" w:hint="default"/>
+        <w:sz w:val="20"/>
+      </w:rPr>
+    </w:lvl>
+  </w:abstractNum>
+  <w:abstractNum w:abstractNumId="17" w15:restartNumberingAfterBreak="0">
+    <w:nsid w:val="6BF607EB"/>
+    <w:multiLevelType w:val="multilevel"/>
+    <w:tmpl w:val="C944E512"/>
+    <w:lvl w:ilvl="0">
+      <w:start w:val="1"/>
+      <w:numFmt w:val="bullet"/>
+      <w:lvlText w:val=""/>
+      <w:lvlJc w:val="left"/>
+      <w:pPr>
+        <w:tabs>
+          <w:tab w:val="num" w:pos="720"/>
+        </w:tabs>
+        <w:ind w:left="720" w:hanging="360"/>
+      </w:pPr>
+      <w:rPr>
+        <w:rFonts w:ascii="Symbol" w:hAnsi="Symbol" w:hint="default"/>
+        <w:sz w:val="20"/>
+      </w:rPr>
+    </w:lvl>
+    <w:lvl w:ilvl="1" w:tentative="1">
+      <w:start w:val="1"/>
+      <w:numFmt w:val="bullet"/>
+      <w:lvlText w:val="o"/>
+      <w:lvlJc w:val="left"/>
+      <w:pPr>
+        <w:tabs>
+          <w:tab w:val="num" w:pos="1440"/>
+        </w:tabs>
+        <w:ind w:left="1440" w:hanging="360"/>
+      </w:pPr>
+      <w:rPr>
+        <w:rFonts w:ascii="Courier New" w:hAnsi="Courier New" w:hint="default"/>
+        <w:sz w:val="20"/>
+      </w:rPr>
+    </w:lvl>
+    <w:lvl w:ilvl="2" w:tentative="1">
+      <w:start w:val="1"/>
+      <w:numFmt w:val="bullet"/>
+      <w:lvlText w:val=""/>
+      <w:lvlJc w:val="left"/>
+      <w:pPr>
+        <w:tabs>
+          <w:tab w:val="num" w:pos="2160"/>
+        </w:tabs>
+        <w:ind w:left="2160" w:hanging="360"/>
+      </w:pPr>
+      <w:rPr>
+        <w:rFonts w:ascii="Wingdings" w:hAnsi="Wingdings" w:hint="default"/>
+        <w:sz w:val="20"/>
+      </w:rPr>
+    </w:lvl>
+    <w:lvl w:ilvl="3" w:tentative="1">
+      <w:start w:val="1"/>
+      <w:numFmt w:val="bullet"/>
+      <w:lvlText w:val=""/>
+      <w:lvlJc w:val="left"/>
+      <w:pPr>
+        <w:tabs>
+          <w:tab w:val="num" w:pos="2880"/>
+        </w:tabs>
+        <w:ind w:left="2880" w:hanging="360"/>
+      </w:pPr>
+      <w:rPr>
+        <w:rFonts w:ascii="Wingdings" w:hAnsi="Wingdings" w:hint="default"/>
+        <w:sz w:val="20"/>
+      </w:rPr>
+    </w:lvl>
+    <w:lvl w:ilvl="4" w:tentative="1">
+      <w:start w:val="1"/>
+      <w:numFmt w:val="bullet"/>
+      <w:lvlText w:val=""/>
+      <w:lvlJc w:val="left"/>
+      <w:pPr>
+        <w:tabs>
+          <w:tab w:val="num" w:pos="3600"/>
+        </w:tabs>
+        <w:ind w:left="3600" w:hanging="360"/>
+      </w:pPr>
+      <w:rPr>
+        <w:rFonts w:ascii="Wingdings" w:hAnsi="Wingdings" w:hint="default"/>
+        <w:sz w:val="20"/>
+      </w:rPr>
+    </w:lvl>
+    <w:lvl w:ilvl="5" w:tentative="1">
+      <w:start w:val="1"/>
+      <w:numFmt w:val="bullet"/>
+      <w:lvlText w:val=""/>
+      <w:lvlJc w:val="left"/>
+      <w:pPr>
+        <w:tabs>
+          <w:tab w:val="num" w:pos="4320"/>
+        </w:tabs>
+        <w:ind w:left="4320" w:hanging="360"/>
+      </w:pPr>
+      <w:rPr>
+        <w:rFonts w:ascii="Wingdings" w:hAnsi="Wingdings" w:hint="default"/>
+        <w:sz w:val="20"/>
+      </w:rPr>
+    </w:lvl>
+    <w:lvl w:ilvl="6" w:tentative="1">
+      <w:start w:val="1"/>
+      <w:numFmt w:val="bullet"/>
+      <w:lvlText w:val=""/>
+      <w:lvlJc w:val="left"/>
+      <w:pPr>
+        <w:tabs>
+          <w:tab w:val="num" w:pos="5040"/>
+        </w:tabs>
+        <w:ind w:left="5040" w:hanging="360"/>
+      </w:pPr>
+      <w:rPr>
+        <w:rFonts w:ascii="Wingdings" w:hAnsi="Wingdings" w:hint="default"/>
+        <w:sz w:val="20"/>
+      </w:rPr>
+    </w:lvl>
+    <w:lvl w:ilvl="7" w:tentative="1">
+      <w:start w:val="1"/>
+      <w:numFmt w:val="bullet"/>
+      <w:lvlText w:val=""/>
+      <w:lvlJc w:val="left"/>
+      <w:pPr>
+        <w:tabs>
+          <w:tab w:val="num" w:pos="5760"/>
+        </w:tabs>
+        <w:ind w:left="5760" w:hanging="360"/>
+      </w:pPr>
+      <w:rPr>
+        <w:rFonts w:ascii="Wingdings" w:hAnsi="Wingdings" w:hint="default"/>
+        <w:sz w:val="20"/>
+      </w:rPr>
+    </w:lvl>
+    <w:lvl w:ilvl="8" w:tentative="1">
+      <w:start w:val="1"/>
+      <w:numFmt w:val="bullet"/>
+      <w:lvlText w:val=""/>
+      <w:lvlJc w:val="left"/>
+      <w:pPr>
+        <w:tabs>
+          <w:tab w:val="num" w:pos="6480"/>
+        </w:tabs>
+        <w:ind w:left="6480" w:hanging="360"/>
+      </w:pPr>
+      <w:rPr>
+        <w:rFonts w:ascii="Wingdings" w:hAnsi="Wingdings" w:hint="default"/>
+        <w:sz w:val="20"/>
+      </w:rPr>
+    </w:lvl>
+  </w:abstractNum>
+  <w:abstractNum w:abstractNumId="18" w15:restartNumberingAfterBreak="0">
+    <w:nsid w:val="6CC179AB"/>
+    <w:multiLevelType w:val="multilevel"/>
+    <w:tmpl w:val="F1AC123C"/>
+    <w:lvl w:ilvl="0">
+      <w:start w:val="1"/>
+      <w:numFmt w:val="bullet"/>
+      <w:lvlText w:val=""/>
+      <w:lvlJc w:val="left"/>
+      <w:pPr>
+        <w:tabs>
+          <w:tab w:val="num" w:pos="720"/>
+        </w:tabs>
+        <w:ind w:left="720" w:hanging="360"/>
+      </w:pPr>
+      <w:rPr>
+        <w:rFonts w:ascii="Symbol" w:hAnsi="Symbol" w:hint="default"/>
+        <w:sz w:val="20"/>
+      </w:rPr>
+    </w:lvl>
+    <w:lvl w:ilvl="1" w:tentative="1">
+      <w:start w:val="1"/>
+      <w:numFmt w:val="bullet"/>
+      <w:lvlText w:val="o"/>
+      <w:lvlJc w:val="left"/>
+      <w:pPr>
+        <w:tabs>
+          <w:tab w:val="num" w:pos="1440"/>
+        </w:tabs>
+        <w:ind w:left="1440" w:hanging="360"/>
+      </w:pPr>
+      <w:rPr>
+        <w:rFonts w:ascii="Courier New" w:hAnsi="Courier New" w:hint="default"/>
+        <w:sz w:val="20"/>
+      </w:rPr>
+    </w:lvl>
+    <w:lvl w:ilvl="2" w:tentative="1">
+      <w:start w:val="1"/>
+      <w:numFmt w:val="bullet"/>
+      <w:lvlText w:val=""/>
+      <w:lvlJc w:val="left"/>
+      <w:pPr>
+        <w:tabs>
+          <w:tab w:val="num" w:pos="2160"/>
+        </w:tabs>
+        <w:ind w:left="2160" w:hanging="360"/>
+      </w:pPr>
+      <w:rPr>
+        <w:rFonts w:ascii="Wingdings" w:hAnsi="Wingdings" w:hint="default"/>
+        <w:sz w:val="20"/>
+      </w:rPr>
+    </w:lvl>
+    <w:lvl w:ilvl="3" w:tentative="1">
+      <w:start w:val="1"/>
+      <w:numFmt w:val="bullet"/>
+      <w:lvlText w:val=""/>
+      <w:lvlJc w:val="left"/>
+      <w:pPr>
+        <w:tabs>
+          <w:tab w:val="num" w:pos="2880"/>
+        </w:tabs>
+        <w:ind w:left="2880" w:hanging="360"/>
+      </w:pPr>
+      <w:rPr>
+        <w:rFonts w:ascii="Wingdings" w:hAnsi="Wingdings" w:hint="default"/>
+        <w:sz w:val="20"/>
+      </w:rPr>
+    </w:lvl>
+    <w:lvl w:ilvl="4" w:tentative="1">
+      <w:start w:val="1"/>
+      <w:numFmt w:val="bullet"/>
+      <w:lvlText w:val=""/>
+      <w:lvlJc w:val="left"/>
+      <w:pPr>
+        <w:tabs>
+          <w:tab w:val="num" w:pos="3600"/>
+        </w:tabs>
+        <w:ind w:left="3600" w:hanging="360"/>
+      </w:pPr>
+      <w:rPr>
+        <w:rFonts w:ascii="Wingdings" w:hAnsi="Wingdings" w:hint="default"/>
+        <w:sz w:val="20"/>
+      </w:rPr>
+    </w:lvl>
+    <w:lvl w:ilvl="5" w:tentative="1">
+      <w:start w:val="1"/>
+      <w:numFmt w:val="bullet"/>
+      <w:lvlText w:val=""/>
+      <w:lvlJc w:val="left"/>
+      <w:pPr>
+        <w:tabs>
+          <w:tab w:val="num" w:pos="4320"/>
+        </w:tabs>
+        <w:ind w:left="4320" w:hanging="360"/>
+      </w:pPr>
+      <w:rPr>
+        <w:rFonts w:ascii="Wingdings" w:hAnsi="Wingdings" w:hint="default"/>
+        <w:sz w:val="20"/>
+      </w:rPr>
+    </w:lvl>
+    <w:lvl w:ilvl="6" w:tentative="1">
+      <w:start w:val="1"/>
+      <w:numFmt w:val="bullet"/>
+      <w:lvlText w:val=""/>
+      <w:lvlJc w:val="left"/>
+      <w:pPr>
+        <w:tabs>
+          <w:tab w:val="num" w:pos="5040"/>
+        </w:tabs>
+        <w:ind w:left="5040" w:hanging="360"/>
+      </w:pPr>
+      <w:rPr>
+        <w:rFonts w:ascii="Wingdings" w:hAnsi="Wingdings" w:hint="default"/>
+        <w:sz w:val="20"/>
+      </w:rPr>
+    </w:lvl>
+    <w:lvl w:ilvl="7" w:tentative="1">
+      <w:start w:val="1"/>
+      <w:numFmt w:val="bullet"/>
+      <w:lvlText w:val=""/>
+      <w:lvlJc w:val="left"/>
+      <w:pPr>
+        <w:tabs>
+          <w:tab w:val="num" w:pos="5760"/>
+        </w:tabs>
+        <w:ind w:left="5760" w:hanging="360"/>
+      </w:pPr>
+      <w:rPr>
+        <w:rFonts w:ascii="Wingdings" w:hAnsi="Wingdings" w:hint="default"/>
+        <w:sz w:val="20"/>
+      </w:rPr>
+    </w:lvl>
+    <w:lvl w:ilvl="8" w:tentative="1">
+      <w:start w:val="1"/>
+      <w:numFmt w:val="bullet"/>
+      <w:lvlText w:val=""/>
+      <w:lvlJc w:val="left"/>
+      <w:pPr>
+        <w:tabs>
+          <w:tab w:val="num" w:pos="6480"/>
+        </w:tabs>
+        <w:ind w:left="6480" w:hanging="360"/>
+      </w:pPr>
+      <w:rPr>
+        <w:rFonts w:ascii="Wingdings" w:hAnsi="Wingdings" w:hint="default"/>
+        <w:sz w:val="20"/>
+      </w:rPr>
+    </w:lvl>
+  </w:abstractNum>
+  <w:abstractNum w:abstractNumId="19" w15:restartNumberingAfterBreak="0">
+    <w:nsid w:val="78A93A12"/>
+    <w:multiLevelType w:val="multilevel"/>
+    <w:tmpl w:val="0EDE95D8"/>
+    <w:lvl w:ilvl="0">
+      <w:start w:val="1"/>
+      <w:numFmt w:val="bullet"/>
+      <w:lvlText w:val=""/>
+      <w:lvlJc w:val="left"/>
+      <w:pPr>
+        <w:tabs>
+          <w:tab w:val="num" w:pos="720"/>
+        </w:tabs>
+        <w:ind w:left="720" w:hanging="360"/>
+      </w:pPr>
+      <w:rPr>
+        <w:rFonts w:ascii="Symbol" w:hAnsi="Symbol" w:hint="default"/>
+        <w:sz w:val="20"/>
+      </w:rPr>
+    </w:lvl>
+    <w:lvl w:ilvl="1" w:tentative="1">
+      <w:start w:val="1"/>
+      <w:numFmt w:val="bullet"/>
+      <w:lvlText w:val="o"/>
+      <w:lvlJc w:val="left"/>
+      <w:pPr>
+        <w:tabs>
+          <w:tab w:val="num" w:pos="1440"/>
+        </w:tabs>
+        <w:ind w:left="1440" w:hanging="360"/>
+      </w:pPr>
+      <w:rPr>
+        <w:rFonts w:ascii="Courier New" w:hAnsi="Courier New" w:hint="default"/>
+        <w:sz w:val="20"/>
+      </w:rPr>
+    </w:lvl>
+    <w:lvl w:ilvl="2" w:tentative="1">
+      <w:start w:val="1"/>
+      <w:numFmt w:val="bullet"/>
+      <w:lvlText w:val=""/>
+      <w:lvlJc w:val="left"/>
+      <w:pPr>
+        <w:tabs>
+          <w:tab w:val="num" w:pos="2160"/>
+        </w:tabs>
+        <w:ind w:left="2160" w:hanging="360"/>
+      </w:pPr>
+      <w:rPr>
+        <w:rFonts w:ascii="Wingdings" w:hAnsi="Wingdings" w:hint="default"/>
+        <w:sz w:val="20"/>
+      </w:rPr>
+    </w:lvl>
+    <w:lvl w:ilvl="3" w:tentative="1">
+      <w:start w:val="1"/>
+      <w:numFmt w:val="bullet"/>
+      <w:lvlText w:val=""/>
+      <w:lvlJc w:val="left"/>
+      <w:pPr>
+        <w:tabs>
+          <w:tab w:val="num" w:pos="2880"/>
+        </w:tabs>
+        <w:ind w:left="2880" w:hanging="360"/>
+      </w:pPr>
+      <w:rPr>
+        <w:rFonts w:ascii="Wingdings" w:hAnsi="Wingdings" w:hint="default"/>
+        <w:sz w:val="20"/>
+      </w:rPr>
+    </w:lvl>
+    <w:lvl w:ilvl="4" w:tentative="1">
+      <w:start w:val="1"/>
+      <w:numFmt w:val="bullet"/>
+      <w:lvlText w:val=""/>
+      <w:lvlJc w:val="left"/>
+      <w:pPr>
+        <w:tabs>
+          <w:tab w:val="num" w:pos="3600"/>
+        </w:tabs>
+        <w:ind w:left="3600" w:hanging="360"/>
+      </w:pPr>
+      <w:rPr>
+        <w:rFonts w:ascii="Wingdings" w:hAnsi="Wingdings" w:hint="default"/>
+        <w:sz w:val="20"/>
+      </w:rPr>
+    </w:lvl>
+    <w:lvl w:ilvl="5" w:tentative="1">
+      <w:start w:val="1"/>
+      <w:numFmt w:val="bullet"/>
+      <w:lvlText w:val=""/>
+      <w:lvlJc w:val="left"/>
+      <w:pPr>
+        <w:tabs>
+          <w:tab w:val="num" w:pos="4320"/>
+        </w:tabs>
+        <w:ind w:left="4320" w:hanging="360"/>
+      </w:pPr>
+      <w:rPr>
+        <w:rFonts w:ascii="Wingdings" w:hAnsi="Wingdings" w:hint="default"/>
+        <w:sz w:val="20"/>
+      </w:rPr>
+    </w:lvl>
+    <w:lvl w:ilvl="6" w:tentative="1">
+      <w:start w:val="1"/>
+      <w:numFmt w:val="bullet"/>
+      <w:lvlText w:val=""/>
+      <w:lvlJc w:val="left"/>
+      <w:pPr>
+        <w:tabs>
+          <w:tab w:val="num" w:pos="5040"/>
+        </w:tabs>
+        <w:ind w:left="5040" w:hanging="360"/>
+      </w:pPr>
+      <w:rPr>
+        <w:rFonts w:ascii="Wingdings" w:hAnsi="Wingdings" w:hint="default"/>
+        <w:sz w:val="20"/>
+      </w:rPr>
+    </w:lvl>
+    <w:lvl w:ilvl="7" w:tentative="1">
+      <w:start w:val="1"/>
+      <w:numFmt w:val="bullet"/>
+      <w:lvlText w:val=""/>
+      <w:lvlJc w:val="left"/>
+      <w:pPr>
+        <w:tabs>
+          <w:tab w:val="num" w:pos="5760"/>
+        </w:tabs>
+        <w:ind w:left="5760" w:hanging="360"/>
+      </w:pPr>
+      <w:rPr>
+        <w:rFonts w:ascii="Wingdings" w:hAnsi="Wingdings" w:hint="default"/>
+        <w:sz w:val="20"/>
+      </w:rPr>
+    </w:lvl>
+    <w:lvl w:ilvl="8" w:tentative="1">
+      <w:start w:val="1"/>
+      <w:numFmt w:val="bullet"/>
+      <w:lvlText w:val=""/>
+      <w:lvlJc w:val="left"/>
+      <w:pPr>
+        <w:tabs>
+          <w:tab w:val="num" w:pos="6480"/>
+        </w:tabs>
+        <w:ind w:left="6480" w:hanging="360"/>
+      </w:pPr>
+      <w:rPr>
+        <w:rFonts w:ascii="Wingdings" w:hAnsi="Wingdings" w:hint="default"/>
+        <w:sz w:val="20"/>
+      </w:rPr>
+    </w:lvl>
+  </w:abstractNum>
+  <w:abstractNum w:abstractNumId="20" w15:restartNumberingAfterBreak="0">
+    <w:nsid w:val="78B628B8"/>
+    <w:multiLevelType w:val="multilevel"/>
+    <w:tmpl w:val="C43A9496"/>
+    <w:lvl w:ilvl="0">
+      <w:start w:val="1"/>
+      <w:numFmt w:val="bullet"/>
+      <w:lvlText w:val=""/>
+      <w:lvlJc w:val="left"/>
+      <w:pPr>
+        <w:tabs>
+          <w:tab w:val="num" w:pos="720"/>
+        </w:tabs>
+        <w:ind w:left="720" w:hanging="360"/>
+      </w:pPr>
+      <w:rPr>
+        <w:rFonts w:ascii="Symbol" w:hAnsi="Symbol" w:hint="default"/>
+        <w:sz w:val="20"/>
+      </w:rPr>
+    </w:lvl>
+    <w:lvl w:ilvl="1" w:tentative="1">
+      <w:start w:val="1"/>
+      <w:numFmt w:val="bullet"/>
+      <w:lvlText w:val="o"/>
+      <w:lvlJc w:val="left"/>
+      <w:pPr>
+        <w:tabs>
+          <w:tab w:val="num" w:pos="1440"/>
+        </w:tabs>
+        <w:ind w:left="1440" w:hanging="360"/>
+      </w:pPr>
+      <w:rPr>
+        <w:rFonts w:ascii="Courier New" w:hAnsi="Courier New" w:hint="default"/>
+        <w:sz w:val="20"/>
+      </w:rPr>
+    </w:lvl>
+    <w:lvl w:ilvl="2" w:tentative="1">
+      <w:start w:val="1"/>
+      <w:numFmt w:val="bullet"/>
+      <w:lvlText w:val=""/>
+      <w:lvlJc w:val="left"/>
+      <w:pPr>
+        <w:tabs>
+          <w:tab w:val="num" w:pos="2160"/>
+        </w:tabs>
+        <w:ind w:left="2160" w:hanging="360"/>
+      </w:pPr>
+      <w:rPr>
+        <w:rFonts w:ascii="Wingdings" w:hAnsi="Wingdings" w:hint="default"/>
+        <w:sz w:val="20"/>
+      </w:rPr>
+    </w:lvl>
+    <w:lvl w:ilvl="3" w:tentative="1">
+      <w:start w:val="1"/>
+      <w:numFmt w:val="bullet"/>
+      <w:lvlText w:val=""/>
+      <w:lvlJc w:val="left"/>
+      <w:pPr>
+        <w:tabs>
+          <w:tab w:val="num" w:pos="2880"/>
+        </w:tabs>
+        <w:ind w:left="2880" w:hanging="360"/>
+      </w:pPr>
+      <w:rPr>
+        <w:rFonts w:ascii="Wingdings" w:hAnsi="Wingdings" w:hint="default"/>
+        <w:sz w:val="20"/>
+      </w:rPr>
+    </w:lvl>
+    <w:lvl w:ilvl="4" w:tentative="1">
+      <w:start w:val="1"/>
+      <w:numFmt w:val="bullet"/>
+      <w:lvlText w:val=""/>
+      <w:lvlJc w:val="left"/>
+      <w:pPr>
+        <w:tabs>
+          <w:tab w:val="num" w:pos="3600"/>
+        </w:tabs>
+        <w:ind w:left="3600" w:hanging="360"/>
+      </w:pPr>
+      <w:rPr>
+        <w:rFonts w:ascii="Wingdings" w:hAnsi="Wingdings" w:hint="default"/>
+        <w:sz w:val="20"/>
+      </w:rPr>
+    </w:lvl>
+    <w:lvl w:ilvl="5" w:tentative="1">
+      <w:start w:val="1"/>
+      <w:numFmt w:val="bullet"/>
+      <w:lvlText w:val=""/>
+      <w:lvlJc w:val="left"/>
+      <w:pPr>
+        <w:tabs>
+          <w:tab w:val="num" w:pos="4320"/>
+        </w:tabs>
+        <w:ind w:left="4320" w:hanging="360"/>
+      </w:pPr>
+      <w:rPr>
+        <w:rFonts w:ascii="Wingdings" w:hAnsi="Wingdings" w:hint="default"/>
+        <w:sz w:val="20"/>
+      </w:rPr>
+    </w:lvl>
+    <w:lvl w:ilvl="6" w:tentative="1">
+      <w:start w:val="1"/>
+      <w:numFmt w:val="bullet"/>
+      <w:lvlText w:val=""/>
+      <w:lvlJc w:val="left"/>
+      <w:pPr>
+        <w:tabs>
+          <w:tab w:val="num" w:pos="5040"/>
+        </w:tabs>
+        <w:ind w:left="5040" w:hanging="360"/>
+      </w:pPr>
+      <w:rPr>
+        <w:rFonts w:ascii="Wingdings" w:hAnsi="Wingdings" w:hint="default"/>
+        <w:sz w:val="20"/>
+      </w:rPr>
+    </w:lvl>
+    <w:lvl w:ilvl="7" w:tentative="1">
+      <w:start w:val="1"/>
+      <w:numFmt w:val="bullet"/>
+      <w:lvlText w:val=""/>
+      <w:lvlJc w:val="left"/>
+      <w:pPr>
+        <w:tabs>
+          <w:tab w:val="num" w:pos="5760"/>
+        </w:tabs>
+        <w:ind w:left="5760" w:hanging="360"/>
+      </w:pPr>
+      <w:rPr>
+        <w:rFonts w:ascii="Wingdings" w:hAnsi="Wingdings" w:hint="default"/>
+        <w:sz w:val="20"/>
+      </w:rPr>
+    </w:lvl>
+    <w:lvl w:ilvl="8" w:tentative="1">
+      <w:start w:val="1"/>
+      <w:numFmt w:val="bullet"/>
+      <w:lvlText w:val=""/>
+      <w:lvlJc w:val="left"/>
+      <w:pPr>
+        <w:tabs>
+          <w:tab w:val="num" w:pos="6480"/>
+        </w:tabs>
+        <w:ind w:left="6480" w:hanging="360"/>
+      </w:pPr>
+      <w:rPr>
+        <w:rFonts w:ascii="Wingdings" w:hAnsi="Wingdings" w:hint="default"/>
+        <w:sz w:val="20"/>
+      </w:rPr>
+    </w:lvl>
+  </w:abstractNum>
+  <w:abstractNum w:abstractNumId="21" w15:restartNumberingAfterBreak="0">
+    <w:nsid w:val="7ABA162A"/>
+    <w:multiLevelType w:val="multilevel"/>
+    <w:tmpl w:val="D778D044"/>
+    <w:lvl w:ilvl="0">
+      <w:start w:val="1"/>
+      <w:numFmt w:val="bullet"/>
+      <w:lvlText w:val=""/>
+      <w:lvlJc w:val="left"/>
+      <w:pPr>
+        <w:tabs>
+          <w:tab w:val="num" w:pos="720"/>
+        </w:tabs>
+        <w:ind w:left="720" w:hanging="360"/>
+      </w:pPr>
+      <w:rPr>
+        <w:rFonts w:ascii="Symbol" w:hAnsi="Symbol" w:hint="default"/>
+        <w:sz w:val="20"/>
+      </w:rPr>
+    </w:lvl>
+    <w:lvl w:ilvl="1" w:tentative="1">
+      <w:start w:val="1"/>
+      <w:numFmt w:val="bullet"/>
+      <w:lvlText w:val="o"/>
+      <w:lvlJc w:val="left"/>
+      <w:pPr>
+        <w:tabs>
+          <w:tab w:val="num" w:pos="1440"/>
+        </w:tabs>
+        <w:ind w:left="1440" w:hanging="360"/>
+      </w:pPr>
+      <w:rPr>
+        <w:rFonts w:ascii="Courier New" w:hAnsi="Courier New" w:hint="default"/>
+        <w:sz w:val="20"/>
+      </w:rPr>
+    </w:lvl>
+    <w:lvl w:ilvl="2" w:tentative="1">
+      <w:start w:val="1"/>
+      <w:numFmt w:val="bullet"/>
+      <w:lvlText w:val=""/>
+      <w:lvlJc w:val="left"/>
+      <w:pPr>
+        <w:tabs>
+          <w:tab w:val="num" w:pos="2160"/>
+        </w:tabs>
+        <w:ind w:left="2160" w:hanging="360"/>
+      </w:pPr>
+      <w:rPr>
+        <w:rFonts w:ascii="Wingdings" w:hAnsi="Wingdings" w:hint="default"/>
+        <w:sz w:val="20"/>
+      </w:rPr>
+    </w:lvl>
+    <w:lvl w:ilvl="3" w:tentative="1">
+      <w:start w:val="1"/>
+      <w:numFmt w:val="bullet"/>
+      <w:lvlText w:val=""/>
+      <w:lvlJc w:val="left"/>
+      <w:pPr>
+        <w:tabs>
+          <w:tab w:val="num" w:pos="2880"/>
+        </w:tabs>
+        <w:ind w:left="2880" w:hanging="360"/>
+      </w:pPr>
+      <w:rPr>
+        <w:rFonts w:ascii="Wingdings" w:hAnsi="Wingdings" w:hint="default"/>
+        <w:sz w:val="20"/>
+      </w:rPr>
+    </w:lvl>
+    <w:lvl w:ilvl="4" w:tentative="1">
+      <w:start w:val="1"/>
+      <w:numFmt w:val="bullet"/>
+      <w:lvlText w:val=""/>
+      <w:lvlJc w:val="left"/>
+      <w:pPr>
+        <w:tabs>
+          <w:tab w:val="num" w:pos="3600"/>
+        </w:tabs>
+        <w:ind w:left="3600" w:hanging="360"/>
+      </w:pPr>
+      <w:rPr>
+        <w:rFonts w:ascii="Wingdings" w:hAnsi="Wingdings" w:hint="default"/>
+        <w:sz w:val="20"/>
+      </w:rPr>
+    </w:lvl>
+    <w:lvl w:ilvl="5" w:tentative="1">
+      <w:start w:val="1"/>
+      <w:numFmt w:val="bullet"/>
+      <w:lvlText w:val=""/>
+      <w:lvlJc w:val="left"/>
+      <w:pPr>
+        <w:tabs>
+          <w:tab w:val="num" w:pos="4320"/>
+        </w:tabs>
+        <w:ind w:left="4320" w:hanging="360"/>
+      </w:pPr>
+      <w:rPr>
+        <w:rFonts w:ascii="Wingdings" w:hAnsi="Wingdings" w:hint="default"/>
+        <w:sz w:val="20"/>
+      </w:rPr>
+    </w:lvl>
+    <w:lvl w:ilvl="6" w:tentative="1">
+      <w:start w:val="1"/>
+      <w:numFmt w:val="bullet"/>
+      <w:lvlText w:val=""/>
+      <w:lvlJc w:val="left"/>
+      <w:pPr>
+        <w:tabs>
+          <w:tab w:val="num" w:pos="5040"/>
+        </w:tabs>
+        <w:ind w:left="5040" w:hanging="360"/>
+      </w:pPr>
+      <w:rPr>
+        <w:rFonts w:ascii="Wingdings" w:hAnsi="Wingdings" w:hint="default"/>
+        <w:sz w:val="20"/>
+      </w:rPr>
+    </w:lvl>
+    <w:lvl w:ilvl="7" w:tentative="1">
+      <w:start w:val="1"/>
+      <w:numFmt w:val="bullet"/>
+      <w:lvlText w:val=""/>
+      <w:lvlJc w:val="left"/>
+      <w:pPr>
+        <w:tabs>
+          <w:tab w:val="num" w:pos="5760"/>
+        </w:tabs>
+        <w:ind w:left="5760" w:hanging="360"/>
+      </w:pPr>
+      <w:rPr>
+        <w:rFonts w:ascii="Wingdings" w:hAnsi="Wingdings" w:hint="default"/>
+        <w:sz w:val="20"/>
+      </w:rPr>
+    </w:lvl>
+    <w:lvl w:ilvl="8" w:tentative="1">
+      <w:start w:val="1"/>
+      <w:numFmt w:val="bullet"/>
+      <w:lvlText w:val=""/>
+      <w:lvlJc w:val="left"/>
+      <w:pPr>
+        <w:tabs>
+          <w:tab w:val="num" w:pos="6480"/>
+        </w:tabs>
+        <w:ind w:left="6480" w:hanging="360"/>
+      </w:pPr>
+      <w:rPr>
+        <w:rFonts w:ascii="Wingdings" w:hAnsi="Wingdings" w:hint="default"/>
+        <w:sz w:val="20"/>
+      </w:rPr>
+    </w:lvl>
+  </w:abstractNum>
+  <w:abstractNum w:abstractNumId="22" w15:restartNumberingAfterBreak="0">
+    <w:nsid w:val="7BF957E8"/>
+    <w:multiLevelType w:val="multilevel"/>
+    <w:tmpl w:val="4F20E558"/>
+    <w:lvl w:ilvl="0">
+      <w:start w:val="1"/>
+      <w:numFmt w:val="bullet"/>
+      <w:lvlText w:val=""/>
+      <w:lvlJc w:val="left"/>
+      <w:pPr>
+        <w:tabs>
+          <w:tab w:val="num" w:pos="720"/>
+        </w:tabs>
+        <w:ind w:left="720" w:hanging="360"/>
+      </w:pPr>
+      <w:rPr>
+        <w:rFonts w:ascii="Symbol" w:hAnsi="Symbol" w:hint="default"/>
+        <w:sz w:val="20"/>
+      </w:rPr>
+    </w:lvl>
+    <w:lvl w:ilvl="1" w:tentative="1">
+      <w:start w:val="1"/>
+      <w:numFmt w:val="bullet"/>
+      <w:lvlText w:val="o"/>
+      <w:lvlJc w:val="left"/>
+      <w:pPr>
+        <w:tabs>
+          <w:tab w:val="num" w:pos="1440"/>
+        </w:tabs>
+        <w:ind w:left="1440" w:hanging="360"/>
+      </w:pPr>
+      <w:rPr>
+        <w:rFonts w:ascii="Courier New" w:hAnsi="Courier New" w:hint="default"/>
+        <w:sz w:val="20"/>
+      </w:rPr>
+    </w:lvl>
+    <w:lvl w:ilvl="2" w:tentative="1">
+      <w:start w:val="1"/>
+      <w:numFmt w:val="bullet"/>
+      <w:lvlText w:val=""/>
+      <w:lvlJc w:val="left"/>
+      <w:pPr>
+        <w:tabs>
+          <w:tab w:val="num" w:pos="2160"/>
+        </w:tabs>
+        <w:ind w:left="2160" w:hanging="360"/>
+      </w:pPr>
+      <w:rPr>
+        <w:rFonts w:ascii="Wingdings" w:hAnsi="Wingdings" w:hint="default"/>
+        <w:sz w:val="20"/>
+      </w:rPr>
+    </w:lvl>
+    <w:lvl w:ilvl="3" w:tentative="1">
+      <w:start w:val="1"/>
+      <w:numFmt w:val="bullet"/>
+      <w:lvlText w:val=""/>
+      <w:lvlJc w:val="left"/>
+      <w:pPr>
+        <w:tabs>
+          <w:tab w:val="num" w:pos="2880"/>
+        </w:tabs>
+        <w:ind w:left="2880" w:hanging="360"/>
+      </w:pPr>
+      <w:rPr>
+        <w:rFonts w:ascii="Wingdings" w:hAnsi="Wingdings" w:hint="default"/>
+        <w:sz w:val="20"/>
+      </w:rPr>
+    </w:lvl>
+    <w:lvl w:ilvl="4" w:tentative="1">
+      <w:start w:val="1"/>
+      <w:numFmt w:val="bullet"/>
+      <w:lvlText w:val=""/>
+      <w:lvlJc w:val="left"/>
+      <w:pPr>
+        <w:tabs>
+          <w:tab w:val="num" w:pos="3600"/>
+        </w:tabs>
+        <w:ind w:left="3600" w:hanging="360"/>
+      </w:pPr>
+      <w:rPr>
+        <w:rFonts w:ascii="Wingdings" w:hAnsi="Wingdings" w:hint="default"/>
+        <w:sz w:val="20"/>
+      </w:rPr>
+    </w:lvl>
+    <w:lvl w:ilvl="5" w:tentative="1">
+      <w:start w:val="1"/>
+      <w:numFmt w:val="bullet"/>
+      <w:lvlText w:val=""/>
+      <w:lvlJc w:val="left"/>
+      <w:pPr>
+        <w:tabs>
+          <w:tab w:val="num" w:pos="4320"/>
+        </w:tabs>
+        <w:ind w:left="4320" w:hanging="360"/>
+      </w:pPr>
+      <w:rPr>
+        <w:rFonts w:ascii="Wingdings" w:hAnsi="Wingdings" w:hint="default"/>
+        <w:sz w:val="20"/>
+      </w:rPr>
+    </w:lvl>
+    <w:lvl w:ilvl="6" w:tentative="1">
+      <w:start w:val="1"/>
+      <w:numFmt w:val="bullet"/>
+      <w:lvlText w:val=""/>
+      <w:lvlJc w:val="left"/>
+      <w:pPr>
+        <w:tabs>
+          <w:tab w:val="num" w:pos="5040"/>
+        </w:tabs>
+        <w:ind w:left="5040" w:hanging="360"/>
+      </w:pPr>
+      <w:rPr>
+        <w:rFonts w:ascii="Wingdings" w:hAnsi="Wingdings" w:hint="default"/>
+        <w:sz w:val="20"/>
+      </w:rPr>
+    </w:lvl>
+    <w:lvl w:ilvl="7" w:tentative="1">
+      <w:start w:val="1"/>
+      <w:numFmt w:val="bullet"/>
+      <w:lvlText w:val=""/>
+      <w:lvlJc w:val="left"/>
+      <w:pPr>
+        <w:tabs>
+          <w:tab w:val="num" w:pos="5760"/>
+        </w:tabs>
+        <w:ind w:left="5760" w:hanging="360"/>
+      </w:pPr>
+      <w:rPr>
+        <w:rFonts w:ascii="Wingdings" w:hAnsi="Wingdings" w:hint="default"/>
+        <w:sz w:val="20"/>
+      </w:rPr>
+    </w:lvl>
+    <w:lvl w:ilvl="8" w:tentative="1">
+      <w:start w:val="1"/>
+      <w:numFmt w:val="bullet"/>
+      <w:lvlText w:val=""/>
+      <w:lvlJc w:val="left"/>
+      <w:pPr>
+        <w:tabs>
+          <w:tab w:val="num" w:pos="6480"/>
+        </w:tabs>
+        <w:ind w:left="6480" w:hanging="360"/>
+      </w:pPr>
+      <w:rPr>
+        <w:rFonts w:ascii="Wingdings" w:hAnsi="Wingdings" w:hint="default"/>
+        <w:sz w:val="20"/>
+      </w:rPr>
+    </w:lvl>
+  </w:abstractNum>
+  <w:num w:numId="1" w16cid:durableId="928779551">
+    <w:abstractNumId w:val="11"/>
+  </w:num>
+  <w:num w:numId="2" w16cid:durableId="2071731596">
+    <w:abstractNumId w:val="0"/>
+  </w:num>
+  <w:num w:numId="3" w16cid:durableId="1380976495">
+    <w:abstractNumId w:val="7"/>
+  </w:num>
+  <w:num w:numId="4" w16cid:durableId="911163507">
+    <w:abstractNumId w:val="16"/>
+  </w:num>
+  <w:num w:numId="5" w16cid:durableId="2004579510">
+    <w:abstractNumId w:val="9"/>
+  </w:num>
+  <w:num w:numId="6" w16cid:durableId="179710970">
+    <w:abstractNumId w:val="6"/>
+  </w:num>
+  <w:num w:numId="7" w16cid:durableId="965352293">
+    <w:abstractNumId w:val="14"/>
+  </w:num>
+  <w:num w:numId="8" w16cid:durableId="733315058">
+    <w:abstractNumId w:val="4"/>
+  </w:num>
+  <w:num w:numId="9" w16cid:durableId="930041776">
+    <w:abstractNumId w:val="3"/>
+  </w:num>
+  <w:num w:numId="10" w16cid:durableId="2067491706">
+    <w:abstractNumId w:val="19"/>
+  </w:num>
+  <w:num w:numId="11" w16cid:durableId="1373504929">
+    <w:abstractNumId w:val="20"/>
+  </w:num>
+  <w:num w:numId="12" w16cid:durableId="642269260">
+    <w:abstractNumId w:val="1"/>
+  </w:num>
+  <w:num w:numId="13" w16cid:durableId="1146623403">
+    <w:abstractNumId w:val="17"/>
+  </w:num>
+  <w:num w:numId="14" w16cid:durableId="1072194961">
+    <w:abstractNumId w:val="21"/>
+  </w:num>
+  <w:num w:numId="15" w16cid:durableId="1253199390">
+    <w:abstractNumId w:val="8"/>
+  </w:num>
+  <w:num w:numId="16" w16cid:durableId="250357980">
+    <w:abstractNumId w:val="2"/>
+  </w:num>
+  <w:num w:numId="17" w16cid:durableId="1332105116">
+    <w:abstractNumId w:val="10"/>
+  </w:num>
+  <w:num w:numId="18" w16cid:durableId="1327053909">
+    <w:abstractNumId w:val="15"/>
+  </w:num>
+  <w:num w:numId="19" w16cid:durableId="1243567402">
+    <w:abstractNumId w:val="12"/>
+  </w:num>
+  <w:num w:numId="20" w16cid:durableId="1801679688">
+    <w:abstractNumId w:val="18"/>
+  </w:num>
+  <w:num w:numId="21" w16cid:durableId="1004623130">
+    <w:abstractNumId w:val="13"/>
+  </w:num>
+  <w:num w:numId="22" w16cid:durableId="1891069696">
+    <w:abstractNumId w:val="22"/>
+  </w:num>
+  <w:num w:numId="23" w16cid:durableId="878516423">
+    <w:abstractNumId w:val="5"/>
+  </w:num>
+</w:numbering>
 </file>
 
 <file path=word/styles.xml><?xml version="1.0" encoding="utf-8"?>

</xml_diff>